<commit_message>
docs: update the system analysis document after #21 to #37
- 9.4: text normalization, DDD codes and masks, empty optional data
- Quadro 23: name, password, brand and model, year, CNPJ, social
  links, service, category and role names, duration display
- Quadro 20: RN033 checks the date only when it changes
- Quadros 26, 28, 33 and 47: UC01 FA01, UC03 step 5 and FA03,
  UC08 FA01 and FE03, UC22 FE01

Co-Authored-By: Claude Opus 5.5 <noreply@anthropic.com>
</commit_message>
<xml_diff>
--- a/documentos-formais/AnaliseDoSistema.docx
+++ b/documentos-formais/AnaliseDoSistema.docx
@@ -240,7 +240,7 @@
       <w:r>
         <w:fldChar w:fldCharType="separate"/>
       </w:r>
-      <w:hyperlink w:anchor="_Toc242917884" w:history="1">
+      <w:hyperlink w:anchor="_Toc243436739" w:history="1">
         <w:r>
           <w:rPr>
             <w:rStyle w:val="Hyperlink"/>
@@ -263,7 +263,7 @@
           <w:rPr>
             <w:webHidden/>
           </w:rPr>
-          <w:instrText xml:space="preserve"> PAGEREF _Toc242917884 \h </w:instrText>
+          <w:instrText xml:space="preserve"> PAGEREF _Toc243436739 \h </w:instrText>
         </w:r>
         <w:r>
           <w:rPr>
@@ -298,7 +298,7 @@
           <w:lang w:eastAsia="pt-BR"/>
         </w:rPr>
       </w:pPr>
-      <w:hyperlink w:anchor="_Toc242917885" w:history="1">
+      <w:hyperlink w:anchor="_Toc243436740" w:history="1">
         <w:r>
           <w:rPr>
             <w:rStyle w:val="Hyperlink"/>
@@ -321,7 +321,7 @@
           <w:rPr>
             <w:webHidden/>
           </w:rPr>
-          <w:instrText xml:space="preserve"> PAGEREF _Toc242917885 \h </w:instrText>
+          <w:instrText xml:space="preserve"> PAGEREF _Toc243436740 \h </w:instrText>
         </w:r>
         <w:r>
           <w:rPr>
@@ -356,7 +356,7 @@
           <w:lang w:eastAsia="pt-BR"/>
         </w:rPr>
       </w:pPr>
-      <w:hyperlink w:anchor="_Toc242917886" w:history="1">
+      <w:hyperlink w:anchor="_Toc243436741" w:history="1">
         <w:r>
           <w:rPr>
             <w:rStyle w:val="Hyperlink"/>
@@ -379,7 +379,7 @@
           <w:rPr>
             <w:webHidden/>
           </w:rPr>
-          <w:instrText xml:space="preserve"> PAGEREF _Toc242917886 \h </w:instrText>
+          <w:instrText xml:space="preserve"> PAGEREF _Toc243436741 \h </w:instrText>
         </w:r>
         <w:r>
           <w:rPr>
@@ -414,7 +414,7 @@
           <w:lang w:eastAsia="pt-BR"/>
         </w:rPr>
       </w:pPr>
-      <w:hyperlink w:anchor="_Toc242917887" w:history="1">
+      <w:hyperlink w:anchor="_Toc243436742" w:history="1">
         <w:r>
           <w:rPr>
             <w:rStyle w:val="Hyperlink"/>
@@ -437,7 +437,7 @@
           <w:rPr>
             <w:webHidden/>
           </w:rPr>
-          <w:instrText xml:space="preserve"> PAGEREF _Toc242917887 \h </w:instrText>
+          <w:instrText xml:space="preserve"> PAGEREF _Toc243436742 \h </w:instrText>
         </w:r>
         <w:r>
           <w:rPr>
@@ -472,7 +472,7 @@
           <w:lang w:eastAsia="pt-BR"/>
         </w:rPr>
       </w:pPr>
-      <w:hyperlink w:anchor="_Toc242917888" w:history="1">
+      <w:hyperlink w:anchor="_Toc243436743" w:history="1">
         <w:r>
           <w:rPr>
             <w:rStyle w:val="Hyperlink"/>
@@ -495,7 +495,7 @@
           <w:rPr>
             <w:webHidden/>
           </w:rPr>
-          <w:instrText xml:space="preserve"> PAGEREF _Toc242917888 \h </w:instrText>
+          <w:instrText xml:space="preserve"> PAGEREF _Toc243436743 \h </w:instrText>
         </w:r>
         <w:r>
           <w:rPr>
@@ -532,7 +532,7 @@
           <w:lang w:eastAsia="pt-BR"/>
         </w:rPr>
       </w:pPr>
-      <w:hyperlink w:anchor="_Toc242917889" w:history="1">
+      <w:hyperlink w:anchor="_Toc243436744" w:history="1">
         <w:r>
           <w:rPr>
             <w:rStyle w:val="Hyperlink"/>
@@ -555,7 +555,7 @@
           <w:rPr>
             <w:webHidden/>
           </w:rPr>
-          <w:instrText xml:space="preserve"> PAGEREF _Toc242917889 \h </w:instrText>
+          <w:instrText xml:space="preserve"> PAGEREF _Toc243436744 \h </w:instrText>
         </w:r>
         <w:r>
           <w:rPr>
@@ -590,7 +590,7 @@
           <w:lang w:eastAsia="pt-BR"/>
         </w:rPr>
       </w:pPr>
-      <w:hyperlink w:anchor="_Toc242917890" w:history="1">
+      <w:hyperlink w:anchor="_Toc243436745" w:history="1">
         <w:r>
           <w:rPr>
             <w:rStyle w:val="Hyperlink"/>
@@ -613,7 +613,7 @@
           <w:rPr>
             <w:webHidden/>
           </w:rPr>
-          <w:instrText xml:space="preserve"> PAGEREF _Toc242917890 \h </w:instrText>
+          <w:instrText xml:space="preserve"> PAGEREF _Toc243436745 \h </w:instrText>
         </w:r>
         <w:r>
           <w:rPr>
@@ -648,7 +648,7 @@
           <w:lang w:eastAsia="pt-BR"/>
         </w:rPr>
       </w:pPr>
-      <w:hyperlink w:anchor="_Toc242917891" w:history="1">
+      <w:hyperlink w:anchor="_Toc243436746" w:history="1">
         <w:r>
           <w:rPr>
             <w:rStyle w:val="Hyperlink"/>
@@ -671,7 +671,7 @@
           <w:rPr>
             <w:webHidden/>
           </w:rPr>
-          <w:instrText xml:space="preserve"> PAGEREF _Toc242917891 \h </w:instrText>
+          <w:instrText xml:space="preserve"> PAGEREF _Toc243436746 \h </w:instrText>
         </w:r>
         <w:r>
           <w:rPr>
@@ -708,7 +708,7 @@
           <w:lang w:eastAsia="pt-BR"/>
         </w:rPr>
       </w:pPr>
-      <w:hyperlink w:anchor="_Toc242917892" w:history="1">
+      <w:hyperlink w:anchor="_Toc243436747" w:history="1">
         <w:r>
           <w:rPr>
             <w:rStyle w:val="Hyperlink"/>
@@ -731,7 +731,7 @@
           <w:rPr>
             <w:webHidden/>
           </w:rPr>
-          <w:instrText xml:space="preserve"> PAGEREF _Toc242917892 \h </w:instrText>
+          <w:instrText xml:space="preserve"> PAGEREF _Toc243436747 \h </w:instrText>
         </w:r>
         <w:r>
           <w:rPr>
@@ -766,7 +766,7 @@
           <w:lang w:eastAsia="pt-BR"/>
         </w:rPr>
       </w:pPr>
-      <w:hyperlink w:anchor="_Toc242917893" w:history="1">
+      <w:hyperlink w:anchor="_Toc243436748" w:history="1">
         <w:r>
           <w:rPr>
             <w:rStyle w:val="Hyperlink"/>
@@ -789,7 +789,7 @@
           <w:rPr>
             <w:webHidden/>
           </w:rPr>
-          <w:instrText xml:space="preserve"> PAGEREF _Toc242917893 \h </w:instrText>
+          <w:instrText xml:space="preserve"> PAGEREF _Toc243436748 \h </w:instrText>
         </w:r>
         <w:r>
           <w:rPr>
@@ -824,7 +824,7 @@
           <w:lang w:eastAsia="pt-BR"/>
         </w:rPr>
       </w:pPr>
-      <w:hyperlink w:anchor="_Toc242917894" w:history="1">
+      <w:hyperlink w:anchor="_Toc243436749" w:history="1">
         <w:r>
           <w:rPr>
             <w:rStyle w:val="Hyperlink"/>
@@ -847,7 +847,7 @@
           <w:rPr>
             <w:webHidden/>
           </w:rPr>
-          <w:instrText xml:space="preserve"> PAGEREF _Toc242917894 \h </w:instrText>
+          <w:instrText xml:space="preserve"> PAGEREF _Toc243436749 \h </w:instrText>
         </w:r>
         <w:r>
           <w:rPr>
@@ -882,7 +882,7 @@
           <w:lang w:eastAsia="pt-BR"/>
         </w:rPr>
       </w:pPr>
-      <w:hyperlink w:anchor="_Toc242917895" w:history="1">
+      <w:hyperlink w:anchor="_Toc243436750" w:history="1">
         <w:r>
           <w:rPr>
             <w:rStyle w:val="Hyperlink"/>
@@ -905,7 +905,7 @@
           <w:rPr>
             <w:webHidden/>
           </w:rPr>
-          <w:instrText xml:space="preserve"> PAGEREF _Toc242917895 \h </w:instrText>
+          <w:instrText xml:space="preserve"> PAGEREF _Toc243436750 \h </w:instrText>
         </w:r>
         <w:r>
           <w:rPr>
@@ -940,7 +940,7 @@
           <w:lang w:eastAsia="pt-BR"/>
         </w:rPr>
       </w:pPr>
-      <w:hyperlink w:anchor="_Toc242917896" w:history="1">
+      <w:hyperlink w:anchor="_Toc243436751" w:history="1">
         <w:r>
           <w:rPr>
             <w:rStyle w:val="Hyperlink"/>
@@ -963,7 +963,7 @@
           <w:rPr>
             <w:webHidden/>
           </w:rPr>
-          <w:instrText xml:space="preserve"> PAGEREF _Toc242917896 \h </w:instrText>
+          <w:instrText xml:space="preserve"> PAGEREF _Toc243436751 \h </w:instrText>
         </w:r>
         <w:r>
           <w:rPr>
@@ -998,7 +998,7 @@
           <w:lang w:eastAsia="pt-BR"/>
         </w:rPr>
       </w:pPr>
-      <w:hyperlink w:anchor="_Toc242917897" w:history="1">
+      <w:hyperlink w:anchor="_Toc243436752" w:history="1">
         <w:r>
           <w:rPr>
             <w:rStyle w:val="Hyperlink"/>
@@ -1021,7 +1021,7 @@
           <w:rPr>
             <w:webHidden/>
           </w:rPr>
-          <w:instrText xml:space="preserve"> PAGEREF _Toc242917897 \h </w:instrText>
+          <w:instrText xml:space="preserve"> PAGEREF _Toc243436752 \h </w:instrText>
         </w:r>
         <w:r>
           <w:rPr>
@@ -1056,7 +1056,7 @@
           <w:lang w:eastAsia="pt-BR"/>
         </w:rPr>
       </w:pPr>
-      <w:hyperlink w:anchor="_Toc242917898" w:history="1">
+      <w:hyperlink w:anchor="_Toc243436753" w:history="1">
         <w:r>
           <w:rPr>
             <w:rStyle w:val="Hyperlink"/>
@@ -1079,7 +1079,7 @@
           <w:rPr>
             <w:webHidden/>
           </w:rPr>
-          <w:instrText xml:space="preserve"> PAGEREF _Toc242917898 \h </w:instrText>
+          <w:instrText xml:space="preserve"> PAGEREF _Toc243436753 \h </w:instrText>
         </w:r>
         <w:r>
           <w:rPr>
@@ -1116,7 +1116,7 @@
           <w:lang w:eastAsia="pt-BR"/>
         </w:rPr>
       </w:pPr>
-      <w:hyperlink w:anchor="_Toc242917899" w:history="1">
+      <w:hyperlink w:anchor="_Toc243436754" w:history="1">
         <w:r>
           <w:rPr>
             <w:rStyle w:val="Hyperlink"/>
@@ -1139,7 +1139,7 @@
           <w:rPr>
             <w:webHidden/>
           </w:rPr>
-          <w:instrText xml:space="preserve"> PAGEREF _Toc242917899 \h </w:instrText>
+          <w:instrText xml:space="preserve"> PAGEREF _Toc243436754 \h </w:instrText>
         </w:r>
         <w:r>
           <w:rPr>
@@ -1174,7 +1174,7 @@
           <w:lang w:eastAsia="pt-BR"/>
         </w:rPr>
       </w:pPr>
-      <w:hyperlink w:anchor="_Toc242917900" w:history="1">
+      <w:hyperlink w:anchor="_Toc243436755" w:history="1">
         <w:r>
           <w:rPr>
             <w:rStyle w:val="Hyperlink"/>
@@ -1197,7 +1197,7 @@
           <w:rPr>
             <w:webHidden/>
           </w:rPr>
-          <w:instrText xml:space="preserve"> PAGEREF _Toc242917900 \h </w:instrText>
+          <w:instrText xml:space="preserve"> PAGEREF _Toc243436755 \h </w:instrText>
         </w:r>
         <w:r>
           <w:rPr>
@@ -1232,7 +1232,7 @@
           <w:lang w:eastAsia="pt-BR"/>
         </w:rPr>
       </w:pPr>
-      <w:hyperlink w:anchor="_Toc242917901" w:history="1">
+      <w:hyperlink w:anchor="_Toc243436756" w:history="1">
         <w:r>
           <w:rPr>
             <w:rStyle w:val="Hyperlink"/>
@@ -1255,7 +1255,7 @@
           <w:rPr>
             <w:webHidden/>
           </w:rPr>
-          <w:instrText xml:space="preserve"> PAGEREF _Toc242917901 \h </w:instrText>
+          <w:instrText xml:space="preserve"> PAGEREF _Toc243436756 \h </w:instrText>
         </w:r>
         <w:r>
           <w:rPr>
@@ -1292,7 +1292,7 @@
           <w:lang w:eastAsia="pt-BR"/>
         </w:rPr>
       </w:pPr>
-      <w:hyperlink w:anchor="_Toc242917902" w:history="1">
+      <w:hyperlink w:anchor="_Toc243436757" w:history="1">
         <w:r>
           <w:rPr>
             <w:rStyle w:val="Hyperlink"/>
@@ -1315,7 +1315,7 @@
           <w:rPr>
             <w:webHidden/>
           </w:rPr>
-          <w:instrText xml:space="preserve"> PAGEREF _Toc242917902 \h </w:instrText>
+          <w:instrText xml:space="preserve"> PAGEREF _Toc243436757 \h </w:instrText>
         </w:r>
         <w:r>
           <w:rPr>
@@ -1352,7 +1352,7 @@
           <w:lang w:eastAsia="pt-BR"/>
         </w:rPr>
       </w:pPr>
-      <w:hyperlink w:anchor="_Toc242917903" w:history="1">
+      <w:hyperlink w:anchor="_Toc243436758" w:history="1">
         <w:r>
           <w:rPr>
             <w:rStyle w:val="Hyperlink"/>
@@ -1375,7 +1375,7 @@
           <w:rPr>
             <w:webHidden/>
           </w:rPr>
-          <w:instrText xml:space="preserve"> PAGEREF _Toc242917903 \h </w:instrText>
+          <w:instrText xml:space="preserve"> PAGEREF _Toc243436758 \h </w:instrText>
         </w:r>
         <w:r>
           <w:rPr>
@@ -1410,7 +1410,7 @@
           <w:lang w:eastAsia="pt-BR"/>
         </w:rPr>
       </w:pPr>
-      <w:hyperlink w:anchor="_Toc242917904" w:history="1">
+      <w:hyperlink w:anchor="_Toc243436759" w:history="1">
         <w:r>
           <w:rPr>
             <w:rStyle w:val="Hyperlink"/>
@@ -1433,7 +1433,7 @@
           <w:rPr>
             <w:webHidden/>
           </w:rPr>
-          <w:instrText xml:space="preserve"> PAGEREF _Toc242917904 \h </w:instrText>
+          <w:instrText xml:space="preserve"> PAGEREF _Toc243436759 \h </w:instrText>
         </w:r>
         <w:r>
           <w:rPr>
@@ -1468,7 +1468,7 @@
           <w:lang w:eastAsia="pt-BR"/>
         </w:rPr>
       </w:pPr>
-      <w:hyperlink w:anchor="_Toc242917905" w:history="1">
+      <w:hyperlink w:anchor="_Toc243436760" w:history="1">
         <w:r>
           <w:rPr>
             <w:rStyle w:val="Hyperlink"/>
@@ -1491,7 +1491,7 @@
           <w:rPr>
             <w:webHidden/>
           </w:rPr>
-          <w:instrText xml:space="preserve"> PAGEREF _Toc242917905 \h </w:instrText>
+          <w:instrText xml:space="preserve"> PAGEREF _Toc243436760 \h </w:instrText>
         </w:r>
         <w:r>
           <w:rPr>
@@ -1526,7 +1526,7 @@
           <w:lang w:eastAsia="pt-BR"/>
         </w:rPr>
       </w:pPr>
-      <w:hyperlink w:anchor="_Toc242917906" w:history="1">
+      <w:hyperlink w:anchor="_Toc243436761" w:history="1">
         <w:r>
           <w:rPr>
             <w:rStyle w:val="Hyperlink"/>
@@ -1549,7 +1549,7 @@
           <w:rPr>
             <w:webHidden/>
           </w:rPr>
-          <w:instrText xml:space="preserve"> PAGEREF _Toc242917906 \h </w:instrText>
+          <w:instrText xml:space="preserve"> PAGEREF _Toc243436761 \h </w:instrText>
         </w:r>
         <w:r>
           <w:rPr>
@@ -1584,7 +1584,7 @@
           <w:lang w:eastAsia="pt-BR"/>
         </w:rPr>
       </w:pPr>
-      <w:hyperlink w:anchor="_Toc242917907" w:history="1">
+      <w:hyperlink w:anchor="_Toc243436762" w:history="1">
         <w:r>
           <w:rPr>
             <w:rStyle w:val="Hyperlink"/>
@@ -1607,7 +1607,7 @@
           <w:rPr>
             <w:webHidden/>
           </w:rPr>
-          <w:instrText xml:space="preserve"> PAGEREF _Toc242917907 \h </w:instrText>
+          <w:instrText xml:space="preserve"> PAGEREF _Toc243436762 \h </w:instrText>
         </w:r>
         <w:r>
           <w:rPr>
@@ -1642,7 +1642,7 @@
           <w:lang w:eastAsia="pt-BR"/>
         </w:rPr>
       </w:pPr>
-      <w:hyperlink w:anchor="_Toc242917908" w:history="1">
+      <w:hyperlink w:anchor="_Toc243436763" w:history="1">
         <w:r>
           <w:rPr>
             <w:rStyle w:val="Hyperlink"/>
@@ -1665,7 +1665,7 @@
           <w:rPr>
             <w:webHidden/>
           </w:rPr>
-          <w:instrText xml:space="preserve"> PAGEREF _Toc242917908 \h </w:instrText>
+          <w:instrText xml:space="preserve"> PAGEREF _Toc243436763 \h </w:instrText>
         </w:r>
         <w:r>
           <w:rPr>
@@ -1700,7 +1700,7 @@
           <w:lang w:eastAsia="pt-BR"/>
         </w:rPr>
       </w:pPr>
-      <w:hyperlink w:anchor="_Toc242917909" w:history="1">
+      <w:hyperlink w:anchor="_Toc243436764" w:history="1">
         <w:r>
           <w:rPr>
             <w:rStyle w:val="Hyperlink"/>
@@ -1723,7 +1723,7 @@
           <w:rPr>
             <w:webHidden/>
           </w:rPr>
-          <w:instrText xml:space="preserve"> PAGEREF _Toc242917909 \h </w:instrText>
+          <w:instrText xml:space="preserve"> PAGEREF _Toc243436764 \h </w:instrText>
         </w:r>
         <w:r>
           <w:rPr>
@@ -1758,7 +1758,7 @@
           <w:lang w:eastAsia="pt-BR"/>
         </w:rPr>
       </w:pPr>
-      <w:hyperlink w:anchor="_Toc242917910" w:history="1">
+      <w:hyperlink w:anchor="_Toc243436765" w:history="1">
         <w:r>
           <w:rPr>
             <w:rStyle w:val="Hyperlink"/>
@@ -1781,7 +1781,7 @@
           <w:rPr>
             <w:webHidden/>
           </w:rPr>
-          <w:instrText xml:space="preserve"> PAGEREF _Toc242917910 \h </w:instrText>
+          <w:instrText xml:space="preserve"> PAGEREF _Toc243436765 \h </w:instrText>
         </w:r>
         <w:r>
           <w:rPr>
@@ -1816,7 +1816,7 @@
           <w:lang w:eastAsia="pt-BR"/>
         </w:rPr>
       </w:pPr>
-      <w:hyperlink w:anchor="_Toc242917911" w:history="1">
+      <w:hyperlink w:anchor="_Toc243436766" w:history="1">
         <w:r>
           <w:rPr>
             <w:rStyle w:val="Hyperlink"/>
@@ -1839,7 +1839,7 @@
           <w:rPr>
             <w:webHidden/>
           </w:rPr>
-          <w:instrText xml:space="preserve"> PAGEREF _Toc242917911 \h </w:instrText>
+          <w:instrText xml:space="preserve"> PAGEREF _Toc243436766 \h </w:instrText>
         </w:r>
         <w:r>
           <w:rPr>
@@ -1874,7 +1874,7 @@
           <w:lang w:eastAsia="pt-BR"/>
         </w:rPr>
       </w:pPr>
-      <w:hyperlink w:anchor="_Toc242917912" w:history="1">
+      <w:hyperlink w:anchor="_Toc243436767" w:history="1">
         <w:r>
           <w:rPr>
             <w:rStyle w:val="Hyperlink"/>
@@ -1897,7 +1897,7 @@
           <w:rPr>
             <w:webHidden/>
           </w:rPr>
-          <w:instrText xml:space="preserve"> PAGEREF _Toc242917912 \h </w:instrText>
+          <w:instrText xml:space="preserve"> PAGEREF _Toc243436767 \h </w:instrText>
         </w:r>
         <w:r>
           <w:rPr>
@@ -1932,7 +1932,7 @@
           <w:lang w:eastAsia="pt-BR"/>
         </w:rPr>
       </w:pPr>
-      <w:hyperlink w:anchor="_Toc242917913" w:history="1">
+      <w:hyperlink w:anchor="_Toc243436768" w:history="1">
         <w:r>
           <w:rPr>
             <w:rStyle w:val="Hyperlink"/>
@@ -1955,7 +1955,7 @@
           <w:rPr>
             <w:webHidden/>
           </w:rPr>
-          <w:instrText xml:space="preserve"> PAGEREF _Toc242917913 \h </w:instrText>
+          <w:instrText xml:space="preserve"> PAGEREF _Toc243436768 \h </w:instrText>
         </w:r>
         <w:r>
           <w:rPr>
@@ -1990,7 +1990,7 @@
           <w:lang w:eastAsia="pt-BR"/>
         </w:rPr>
       </w:pPr>
-      <w:hyperlink w:anchor="_Toc242917914" w:history="1">
+      <w:hyperlink w:anchor="_Toc243436769" w:history="1">
         <w:r>
           <w:rPr>
             <w:rStyle w:val="Hyperlink"/>
@@ -2013,7 +2013,7 @@
           <w:rPr>
             <w:webHidden/>
           </w:rPr>
-          <w:instrText xml:space="preserve"> PAGEREF _Toc242917914 \h </w:instrText>
+          <w:instrText xml:space="preserve"> PAGEREF _Toc243436769 \h </w:instrText>
         </w:r>
         <w:r>
           <w:rPr>
@@ -2048,7 +2048,7 @@
           <w:lang w:eastAsia="pt-BR"/>
         </w:rPr>
       </w:pPr>
-      <w:hyperlink w:anchor="_Toc242917915" w:history="1">
+      <w:hyperlink w:anchor="_Toc243436770" w:history="1">
         <w:r>
           <w:rPr>
             <w:rStyle w:val="Hyperlink"/>
@@ -2071,7 +2071,7 @@
           <w:rPr>
             <w:webHidden/>
           </w:rPr>
-          <w:instrText xml:space="preserve"> PAGEREF _Toc242917915 \h </w:instrText>
+          <w:instrText xml:space="preserve"> PAGEREF _Toc243436770 \h </w:instrText>
         </w:r>
         <w:r>
           <w:rPr>
@@ -2106,7 +2106,7 @@
           <w:lang w:eastAsia="pt-BR"/>
         </w:rPr>
       </w:pPr>
-      <w:hyperlink w:anchor="_Toc242917916" w:history="1">
+      <w:hyperlink w:anchor="_Toc243436771" w:history="1">
         <w:r>
           <w:rPr>
             <w:rStyle w:val="Hyperlink"/>
@@ -2129,7 +2129,7 @@
           <w:rPr>
             <w:webHidden/>
           </w:rPr>
-          <w:instrText xml:space="preserve"> PAGEREF _Toc242917916 \h </w:instrText>
+          <w:instrText xml:space="preserve"> PAGEREF _Toc243436771 \h </w:instrText>
         </w:r>
         <w:r>
           <w:rPr>
@@ -2164,7 +2164,7 @@
           <w:lang w:eastAsia="pt-BR"/>
         </w:rPr>
       </w:pPr>
-      <w:hyperlink w:anchor="_Toc242917917" w:history="1">
+      <w:hyperlink w:anchor="_Toc243436772" w:history="1">
         <w:r>
           <w:rPr>
             <w:rStyle w:val="Hyperlink"/>
@@ -2187,7 +2187,7 @@
           <w:rPr>
             <w:webHidden/>
           </w:rPr>
-          <w:instrText xml:space="preserve"> PAGEREF _Toc242917917 \h </w:instrText>
+          <w:instrText xml:space="preserve"> PAGEREF _Toc243436772 \h </w:instrText>
         </w:r>
         <w:r>
           <w:rPr>
@@ -2224,7 +2224,7 @@
           <w:lang w:eastAsia="pt-BR"/>
         </w:rPr>
       </w:pPr>
-      <w:hyperlink w:anchor="_Toc242917918" w:history="1">
+      <w:hyperlink w:anchor="_Toc243436773" w:history="1">
         <w:r>
           <w:rPr>
             <w:rStyle w:val="Hyperlink"/>
@@ -2247,7 +2247,7 @@
           <w:rPr>
             <w:webHidden/>
           </w:rPr>
-          <w:instrText xml:space="preserve"> PAGEREF _Toc242917918 \h </w:instrText>
+          <w:instrText xml:space="preserve"> PAGEREF _Toc243436773 \h </w:instrText>
         </w:r>
         <w:r>
           <w:rPr>
@@ -2284,7 +2284,7 @@
           <w:lang w:eastAsia="pt-BR"/>
         </w:rPr>
       </w:pPr>
-      <w:hyperlink w:anchor="_Toc242917919" w:history="1">
+      <w:hyperlink w:anchor="_Toc243436774" w:history="1">
         <w:r>
           <w:rPr>
             <w:rStyle w:val="Hyperlink"/>
@@ -2307,7 +2307,7 @@
           <w:rPr>
             <w:webHidden/>
           </w:rPr>
-          <w:instrText xml:space="preserve"> PAGEREF _Toc242917919 \h </w:instrText>
+          <w:instrText xml:space="preserve"> PAGEREF _Toc243436774 \h </w:instrText>
         </w:r>
         <w:r>
           <w:rPr>
@@ -2344,7 +2344,7 @@
           <w:lang w:eastAsia="pt-BR"/>
         </w:rPr>
       </w:pPr>
-      <w:hyperlink w:anchor="_Toc242917920" w:history="1">
+      <w:hyperlink w:anchor="_Toc243436775" w:history="1">
         <w:r>
           <w:rPr>
             <w:rStyle w:val="Hyperlink"/>
@@ -2367,7 +2367,7 @@
           <w:rPr>
             <w:webHidden/>
           </w:rPr>
-          <w:instrText xml:space="preserve"> PAGEREF _Toc242917920 \h </w:instrText>
+          <w:instrText xml:space="preserve"> PAGEREF _Toc243436775 \h </w:instrText>
         </w:r>
         <w:r>
           <w:rPr>
@@ -2402,7 +2402,7 @@
           <w:lang w:eastAsia="pt-BR"/>
         </w:rPr>
       </w:pPr>
-      <w:hyperlink w:anchor="_Toc242917921" w:history="1">
+      <w:hyperlink w:anchor="_Toc243436776" w:history="1">
         <w:r>
           <w:rPr>
             <w:rStyle w:val="Hyperlink"/>
@@ -2425,7 +2425,7 @@
           <w:rPr>
             <w:webHidden/>
           </w:rPr>
-          <w:instrText xml:space="preserve"> PAGEREF _Toc242917921 \h </w:instrText>
+          <w:instrText xml:space="preserve"> PAGEREF _Toc243436776 \h </w:instrText>
         </w:r>
         <w:r>
           <w:rPr>
@@ -2460,7 +2460,7 @@
           <w:lang w:eastAsia="pt-BR"/>
         </w:rPr>
       </w:pPr>
-      <w:hyperlink w:anchor="_Toc242917922" w:history="1">
+      <w:hyperlink w:anchor="_Toc243436777" w:history="1">
         <w:r>
           <w:rPr>
             <w:rStyle w:val="Hyperlink"/>
@@ -2483,7 +2483,7 @@
           <w:rPr>
             <w:webHidden/>
           </w:rPr>
-          <w:instrText xml:space="preserve"> PAGEREF _Toc242917922 \h </w:instrText>
+          <w:instrText xml:space="preserve"> PAGEREF _Toc243436777 \h </w:instrText>
         </w:r>
         <w:r>
           <w:rPr>
@@ -2518,7 +2518,7 @@
           <w:lang w:eastAsia="pt-BR"/>
         </w:rPr>
       </w:pPr>
-      <w:hyperlink w:anchor="_Toc242917923" w:history="1">
+      <w:hyperlink w:anchor="_Toc243436778" w:history="1">
         <w:r>
           <w:rPr>
             <w:rStyle w:val="Hyperlink"/>
@@ -2541,7 +2541,7 @@
           <w:rPr>
             <w:webHidden/>
           </w:rPr>
-          <w:instrText xml:space="preserve"> PAGEREF _Toc242917923 \h </w:instrText>
+          <w:instrText xml:space="preserve"> PAGEREF _Toc243436778 \h </w:instrText>
         </w:r>
         <w:r>
           <w:rPr>
@@ -2576,7 +2576,7 @@
           <w:lang w:eastAsia="pt-BR"/>
         </w:rPr>
       </w:pPr>
-      <w:hyperlink w:anchor="_Toc242917924" w:history="1">
+      <w:hyperlink w:anchor="_Toc243436779" w:history="1">
         <w:r>
           <w:rPr>
             <w:rStyle w:val="Hyperlink"/>
@@ -2599,7 +2599,7 @@
           <w:rPr>
             <w:webHidden/>
           </w:rPr>
-          <w:instrText xml:space="preserve"> PAGEREF _Toc242917924 \h </w:instrText>
+          <w:instrText xml:space="preserve"> PAGEREF _Toc243436779 \h </w:instrText>
         </w:r>
         <w:r>
           <w:rPr>
@@ -2636,7 +2636,7 @@
           <w:lang w:eastAsia="pt-BR"/>
         </w:rPr>
       </w:pPr>
-      <w:hyperlink w:anchor="_Toc242917925" w:history="1">
+      <w:hyperlink w:anchor="_Toc243436780" w:history="1">
         <w:r>
           <w:rPr>
             <w:rStyle w:val="Hyperlink"/>
@@ -2659,7 +2659,7 @@
           <w:rPr>
             <w:webHidden/>
           </w:rPr>
-          <w:instrText xml:space="preserve"> PAGEREF _Toc242917925 \h </w:instrText>
+          <w:instrText xml:space="preserve"> PAGEREF _Toc243436780 \h </w:instrText>
         </w:r>
         <w:r>
           <w:rPr>
@@ -2694,7 +2694,7 @@
           <w:lang w:eastAsia="pt-BR"/>
         </w:rPr>
       </w:pPr>
-      <w:hyperlink w:anchor="_Toc242917926" w:history="1">
+      <w:hyperlink w:anchor="_Toc243436781" w:history="1">
         <w:r>
           <w:rPr>
             <w:rStyle w:val="Hyperlink"/>
@@ -2717,7 +2717,7 @@
           <w:rPr>
             <w:webHidden/>
           </w:rPr>
-          <w:instrText xml:space="preserve"> PAGEREF _Toc242917926 \h </w:instrText>
+          <w:instrText xml:space="preserve"> PAGEREF _Toc243436781 \h </w:instrText>
         </w:r>
         <w:r>
           <w:rPr>
@@ -2752,7 +2752,7 @@
           <w:lang w:eastAsia="pt-BR"/>
         </w:rPr>
       </w:pPr>
-      <w:hyperlink w:anchor="_Toc242917927" w:history="1">
+      <w:hyperlink w:anchor="_Toc243436782" w:history="1">
         <w:r>
           <w:rPr>
             <w:rStyle w:val="Hyperlink"/>
@@ -2775,7 +2775,7 @@
           <w:rPr>
             <w:webHidden/>
           </w:rPr>
-          <w:instrText xml:space="preserve"> PAGEREF _Toc242917927 \h </w:instrText>
+          <w:instrText xml:space="preserve"> PAGEREF _Toc243436782 \h </w:instrText>
         </w:r>
         <w:r>
           <w:rPr>
@@ -2824,7 +2824,7 @@
       <w:pPr>
         <w:pStyle w:val="Ttulo1"/>
       </w:pPr>
-      <w:bookmarkStart w:id="0" w:name="_Toc242917884"/>
+      <w:bookmarkStart w:id="0" w:name="_Toc243436739"/>
       <w:r>
         <w:lastRenderedPageBreak/>
         <w:t>INTRODUÇÃO</w:t>
@@ -2861,7 +2861,7 @@
       <w:pPr>
         <w:pStyle w:val="Ttulo2"/>
       </w:pPr>
-      <w:bookmarkStart w:id="1" w:name="_Toc242917885"/>
+      <w:bookmarkStart w:id="1" w:name="_Toc243436740"/>
       <w:r>
         <w:t>Visão Geral do Sistema</w:t>
       </w:r>
@@ -2914,7 +2914,7 @@
       <w:pPr>
         <w:pStyle w:val="Ttulo2"/>
       </w:pPr>
-      <w:bookmarkStart w:id="2" w:name="_Toc242917886"/>
+      <w:bookmarkStart w:id="2" w:name="_Toc243436741"/>
       <w:r>
         <w:t>Contexto do Projeto</w:t>
       </w:r>
@@ -2942,7 +2942,7 @@
       <w:pPr>
         <w:pStyle w:val="Ttulo2"/>
       </w:pPr>
-      <w:bookmarkStart w:id="3" w:name="_Toc242917887"/>
+      <w:bookmarkStart w:id="3" w:name="_Toc243436742"/>
       <w:r>
         <w:lastRenderedPageBreak/>
         <w:t>Convenções Adotadas</w:t>
@@ -3469,7 +3469,7 @@
       <w:pPr>
         <w:pStyle w:val="Ttulo2"/>
       </w:pPr>
-      <w:bookmarkStart w:id="4" w:name="_Toc242917888"/>
+      <w:bookmarkStart w:id="4" w:name="_Toc243436743"/>
       <w:r>
         <w:t>Documentos Relacionados</w:t>
       </w:r>
@@ -3512,7 +3512,7 @@
       <w:pPr>
         <w:pStyle w:val="Ttulo1"/>
       </w:pPr>
-      <w:bookmarkStart w:id="5" w:name="_Toc242917889"/>
+      <w:bookmarkStart w:id="5" w:name="_Toc243436744"/>
       <w:r>
         <w:lastRenderedPageBreak/>
         <w:t>OBJETIVOS DO PROJETO</w:t>
@@ -3523,7 +3523,7 @@
       <w:pPr>
         <w:pStyle w:val="Ttulo2"/>
       </w:pPr>
-      <w:bookmarkStart w:id="6" w:name="_Toc242917890"/>
+      <w:bookmarkStart w:id="6" w:name="_Toc243436745"/>
       <w:r>
         <w:t>Objetivo Geral</w:t>
       </w:r>
@@ -3551,7 +3551,7 @@
       <w:pPr>
         <w:pStyle w:val="Ttulo2"/>
       </w:pPr>
-      <w:bookmarkStart w:id="7" w:name="_Toc242917891"/>
+      <w:bookmarkStart w:id="7" w:name="_Toc243436746"/>
       <w:r>
         <w:t>Objetivos Específicos</w:t>
       </w:r>
@@ -3690,7 +3690,7 @@
       <w:pPr>
         <w:pStyle w:val="Ttulo1"/>
       </w:pPr>
-      <w:bookmarkStart w:id="8" w:name="_Toc242917892"/>
+      <w:bookmarkStart w:id="8" w:name="_Toc243436747"/>
       <w:r>
         <w:lastRenderedPageBreak/>
         <w:t>DECLARAÇÃO DE ESCOPO</w:t>
@@ -3701,7 +3701,7 @@
       <w:pPr>
         <w:pStyle w:val="Ttulo2"/>
       </w:pPr>
-      <w:bookmarkStart w:id="9" w:name="_Toc242917893"/>
+      <w:bookmarkStart w:id="9" w:name="_Toc243436748"/>
       <w:r>
         <w:t>Descrição do Produto</w:t>
       </w:r>
@@ -3729,7 +3729,7 @@
       <w:pPr>
         <w:pStyle w:val="Ttulo2"/>
       </w:pPr>
-      <w:bookmarkStart w:id="10" w:name="_Toc242917894"/>
+      <w:bookmarkStart w:id="10" w:name="_Toc243436749"/>
       <w:r>
         <w:t>Escopo do Produto</w:t>
       </w:r>
@@ -4612,7 +4612,7 @@
       <w:pPr>
         <w:pStyle w:val="Ttulo2"/>
       </w:pPr>
-      <w:bookmarkStart w:id="11" w:name="_Toc242917895"/>
+      <w:bookmarkStart w:id="11" w:name="_Toc243436750"/>
       <w:r>
         <w:t>Fora do Escopo</w:t>
       </w:r>
@@ -4727,7 +4727,7 @@
       <w:pPr>
         <w:pStyle w:val="Ttulo2"/>
       </w:pPr>
-      <w:bookmarkStart w:id="12" w:name="_Toc242917896"/>
+      <w:bookmarkStart w:id="12" w:name="_Toc243436751"/>
       <w:r>
         <w:lastRenderedPageBreak/>
         <w:t>Premissas</w:t>
@@ -4795,7 +4795,7 @@
       <w:pPr>
         <w:pStyle w:val="Ttulo2"/>
       </w:pPr>
-      <w:bookmarkStart w:id="13" w:name="_Toc242917897"/>
+      <w:bookmarkStart w:id="13" w:name="_Toc243436752"/>
       <w:r>
         <w:t>Restrições</w:t>
       </w:r>
@@ -4874,7 +4874,7 @@
       <w:pPr>
         <w:pStyle w:val="Ttulo2"/>
       </w:pPr>
-      <w:bookmarkStart w:id="14" w:name="_Toc242917898"/>
+      <w:bookmarkStart w:id="14" w:name="_Toc243436753"/>
       <w:r>
         <w:t>Entregas</w:t>
       </w:r>
@@ -4951,7 +4951,7 @@
       <w:pPr>
         <w:pStyle w:val="Ttulo1"/>
       </w:pPr>
-      <w:bookmarkStart w:id="15" w:name="_Toc242917899"/>
+      <w:bookmarkStart w:id="15" w:name="_Toc243436754"/>
       <w:r>
         <w:lastRenderedPageBreak/>
         <w:t>GLOSSÁRIO E ABREVIAÇÕES</w:t>
@@ -4962,7 +4962,7 @@
       <w:pPr>
         <w:pStyle w:val="Ttulo2"/>
       </w:pPr>
-      <w:bookmarkStart w:id="16" w:name="_Toc242917900"/>
+      <w:bookmarkStart w:id="16" w:name="_Toc243436755"/>
       <w:r>
         <w:t>Glossário</w:t>
       </w:r>
@@ -5931,7 +5931,7 @@
       <w:pPr>
         <w:pStyle w:val="Ttulo2"/>
       </w:pPr>
-      <w:bookmarkStart w:id="17" w:name="_Toc242917901"/>
+      <w:bookmarkStart w:id="17" w:name="_Toc243436756"/>
       <w:r>
         <w:t>Abreviações e Siglas</w:t>
       </w:r>
@@ -6689,7 +6689,7 @@
       <w:pPr>
         <w:pStyle w:val="Ttulo1"/>
       </w:pPr>
-      <w:bookmarkStart w:id="18" w:name="_Toc242917902"/>
+      <w:bookmarkStart w:id="18" w:name="_Toc243436757"/>
       <w:r>
         <w:lastRenderedPageBreak/>
         <w:t>ATORES DO SISTEMA</w:t>
@@ -7041,8 +7041,9 @@
       <w:pPr>
         <w:pStyle w:val="Ttulo1"/>
       </w:pPr>
-      <w:bookmarkStart w:id="19" w:name="_Toc242917903"/>
+      <w:bookmarkStart w:id="19" w:name="_Toc243436758"/>
       <w:r>
+        <w:lastRenderedPageBreak/>
         <w:t>REQUISITOS FUNCIONAIS</w:t>
       </w:r>
       <w:bookmarkEnd w:id="19"/>
@@ -7059,7 +7060,7 @@
       <w:pPr>
         <w:pStyle w:val="Ttulo2"/>
       </w:pPr>
-      <w:bookmarkStart w:id="20" w:name="_Toc242917904"/>
+      <w:bookmarkStart w:id="20" w:name="_Toc243436759"/>
       <w:r>
         <w:t>Portal Público e do Cliente</w:t>
       </w:r>
@@ -7077,7 +7078,7 @@
       <w:pPr>
         <w:pStyle w:val="Ttulo3"/>
       </w:pPr>
-      <w:bookmarkStart w:id="21" w:name="_Toc242917905"/>
+      <w:bookmarkStart w:id="21" w:name="_Toc243436760"/>
       <w:r>
         <w:t>Página Inicial e Catálogo</w:t>
       </w:r>
@@ -7530,7 +7531,7 @@
       <w:pPr>
         <w:pStyle w:val="Ttulo3"/>
       </w:pPr>
-      <w:bookmarkStart w:id="28" w:name="_Toc242917906"/>
+      <w:bookmarkStart w:id="28" w:name="_Toc243436761"/>
       <w:r>
         <w:t>Cadastro e Autenticação de Clientes</w:t>
       </w:r>
@@ -7760,6 +7761,7 @@
             </w:pPr>
             <w:bookmarkStart w:id="31" w:name="RF009"/>
             <w:r>
+              <w:lastRenderedPageBreak/>
               <w:t>RF009</w:t>
             </w:r>
             <w:bookmarkEnd w:id="31"/>
@@ -7937,7 +7939,7 @@
       <w:pPr>
         <w:pStyle w:val="Ttulo3"/>
       </w:pPr>
-      <w:bookmarkStart w:id="34" w:name="_Toc242917907"/>
+      <w:bookmarkStart w:id="34" w:name="_Toc243436762"/>
       <w:r>
         <w:t>Área do Cliente</w:t>
       </w:r>
@@ -8441,7 +8443,7 @@
       <w:pPr>
         <w:pStyle w:val="Ttulo3"/>
       </w:pPr>
-      <w:bookmarkStart w:id="42" w:name="_Toc242917908"/>
+      <w:bookmarkStart w:id="42" w:name="_Toc243436763"/>
       <w:r>
         <w:t>Agendamento de Serviços</w:t>
       </w:r>
@@ -8800,6 +8802,7 @@
             </w:pPr>
             <w:bookmarkStart w:id="47" w:name="RF023"/>
             <w:r>
+              <w:lastRenderedPageBreak/>
               <w:t>RF023</w:t>
             </w:r>
             <w:bookmarkEnd w:id="47"/>
@@ -9096,7 +9099,7 @@
       <w:pPr>
         <w:pStyle w:val="Ttulo3"/>
       </w:pPr>
-      <w:bookmarkStart w:id="52" w:name="_Toc242917909"/>
+      <w:bookmarkStart w:id="52" w:name="_Toc243436764"/>
       <w:r>
         <w:t>Acompanhamento de Agendamentos</w:t>
       </w:r>
@@ -9504,7 +9507,7 @@
       <w:pPr>
         <w:pStyle w:val="Ttulo2"/>
       </w:pPr>
-      <w:bookmarkStart w:id="58" w:name="_Toc242917910"/>
+      <w:bookmarkStart w:id="58" w:name="_Toc243436765"/>
       <w:r>
         <w:t>Painel Administrativo</w:t>
       </w:r>
@@ -9522,8 +9525,9 @@
       <w:pPr>
         <w:pStyle w:val="Ttulo3"/>
       </w:pPr>
-      <w:bookmarkStart w:id="59" w:name="_Toc242917911"/>
+      <w:bookmarkStart w:id="59" w:name="_Toc243436766"/>
       <w:r>
+        <w:lastRenderedPageBreak/>
         <w:t>Autenticação e Controle de Acesso</w:t>
       </w:r>
       <w:bookmarkEnd w:id="59"/>
@@ -10069,7 +10073,7 @@
       <w:pPr>
         <w:pStyle w:val="Ttulo3"/>
       </w:pPr>
-      <w:bookmarkStart w:id="67" w:name="_Toc242917912"/>
+      <w:bookmarkStart w:id="67" w:name="_Toc243436767"/>
       <w:r>
         <w:t>Dashboard</w:t>
       </w:r>
@@ -10403,7 +10407,7 @@
       <w:pPr>
         <w:pStyle w:val="Ttulo3"/>
       </w:pPr>
-      <w:bookmarkStart w:id="72" w:name="_Toc242917913"/>
+      <w:bookmarkStart w:id="72" w:name="_Toc243436768"/>
       <w:r>
         <w:t>Gestão de Agendamentos</w:t>
       </w:r>
@@ -10681,6 +10685,7 @@
             </w:pPr>
             <w:bookmarkStart w:id="76" w:name="RF047"/>
             <w:r>
+              <w:lastRenderedPageBreak/>
               <w:t>RF047</w:t>
             </w:r>
             <w:bookmarkEnd w:id="76"/>
@@ -11250,7 +11255,7 @@
       <w:pPr>
         <w:pStyle w:val="Ttulo3"/>
       </w:pPr>
-      <w:bookmarkStart w:id="86" w:name="_Toc242917914"/>
+      <w:bookmarkStart w:id="86" w:name="_Toc243436769"/>
       <w:r>
         <w:t>Gestão de Serviços e Categorias</w:t>
       </w:r>
@@ -11587,6 +11592,7 @@
             </w:pPr>
             <w:bookmarkStart w:id="91" w:name="RF061"/>
             <w:r>
+              <w:lastRenderedPageBreak/>
               <w:t>RF061</w:t>
             </w:r>
             <w:bookmarkEnd w:id="91"/>
@@ -12049,7 +12055,7 @@
       <w:pPr>
         <w:pStyle w:val="Ttulo3"/>
       </w:pPr>
-      <w:bookmarkStart w:id="99" w:name="_Toc242917915"/>
+      <w:bookmarkStart w:id="99" w:name="_Toc243436770"/>
       <w:r>
         <w:t>Gestão de Clientes e Veículos</w:t>
       </w:r>
@@ -12623,8 +12629,9 @@
       <w:pPr>
         <w:pStyle w:val="Ttulo3"/>
       </w:pPr>
-      <w:bookmarkStart w:id="108" w:name="_Toc242917916"/>
+      <w:bookmarkStart w:id="108" w:name="_Toc243436771"/>
       <w:r>
+        <w:lastRenderedPageBreak/>
         <w:t>Gestão de Funcionários e Cargos</w:t>
       </w:r>
       <w:bookmarkEnd w:id="108"/>
@@ -13197,7 +13204,7 @@
       <w:pPr>
         <w:pStyle w:val="Ttulo3"/>
       </w:pPr>
-      <w:bookmarkStart w:id="117" w:name="_Toc242917917"/>
+      <w:bookmarkStart w:id="117" w:name="_Toc243436772"/>
       <w:r>
         <w:t>Configurações</w:t>
       </w:r>
@@ -13535,8 +13542,9 @@
       <w:pPr>
         <w:pStyle w:val="Ttulo1"/>
       </w:pPr>
-      <w:bookmarkStart w:id="122" w:name="_Toc242917918"/>
+      <w:bookmarkStart w:id="122" w:name="_Toc243436773"/>
       <w:r>
+        <w:lastRenderedPageBreak/>
         <w:t>REQUISITOS NÃO FUNCIONAIS</w:t>
       </w:r>
       <w:bookmarkEnd w:id="122"/>
@@ -14310,6 +14318,7 @@
             </w:pPr>
             <w:bookmarkStart w:id="133" w:name="RNF011"/>
             <w:r>
+              <w:lastRenderedPageBreak/>
               <w:t>RNF011</w:t>
             </w:r>
             <w:bookmarkEnd w:id="133"/>
@@ -14676,8 +14685,9 @@
       <w:pPr>
         <w:pStyle w:val="Ttulo1"/>
       </w:pPr>
-      <w:bookmarkStart w:id="139" w:name="_Toc242917919"/>
+      <w:bookmarkStart w:id="139" w:name="_Toc243436774"/>
       <w:r>
+        <w:lastRenderedPageBreak/>
         <w:t>REQUISITOS DE SEGURANÇA</w:t>
       </w:r>
       <w:bookmarkEnd w:id="139"/>
@@ -15490,6 +15500,7 @@
             </w:pPr>
             <w:bookmarkStart w:id="153" w:name="RS014"/>
             <w:r>
+              <w:lastRenderedPageBreak/>
               <w:t>RS014</w:t>
             </w:r>
             <w:bookmarkEnd w:id="153"/>
@@ -15755,8 +15766,9 @@
       <w:pPr>
         <w:pStyle w:val="Ttulo1"/>
       </w:pPr>
-      <w:bookmarkStart w:id="158" w:name="_Toc242917920"/>
+      <w:bookmarkStart w:id="158" w:name="_Toc243436775"/>
       <w:r>
+        <w:lastRenderedPageBreak/>
         <w:t>REGRAS DE NEGÓCIO</w:t>
       </w:r>
       <w:bookmarkEnd w:id="158"/>
@@ -15773,7 +15785,7 @@
       <w:pPr>
         <w:pStyle w:val="Ttulo2"/>
       </w:pPr>
-      <w:bookmarkStart w:id="159" w:name="_Toc242917921"/>
+      <w:bookmarkStart w:id="159" w:name="_Toc243436776"/>
       <w:r>
         <w:t>Relação das Regras de Negócio</w:t>
       </w:r>
@@ -16418,6 +16430,7 @@
             </w:pPr>
             <w:bookmarkStart w:id="170" w:name="RN011"/>
             <w:r>
+              <w:lastRenderedPageBreak/>
               <w:t>RN011</w:t>
             </w:r>
             <w:bookmarkEnd w:id="170"/>
@@ -16993,6 +17006,7 @@
             </w:pPr>
             <w:bookmarkStart w:id="182" w:name="RN023"/>
             <w:r>
+              <w:lastRenderedPageBreak/>
               <w:t>RN023</w:t>
             </w:r>
             <w:bookmarkEnd w:id="182"/>
@@ -17515,6 +17529,7 @@
             </w:pPr>
             <w:bookmarkStart w:id="192" w:name="RN033"/>
             <w:r>
+              <w:lastRenderedPageBreak/>
               <w:t>RN033</w:t>
             </w:r>
             <w:bookmarkEnd w:id="192"/>
@@ -17553,7 +17568,19 @@
               </w:r>
             </w:hyperlink>
             <w:r>
-              <w:t>). Se alterados pelo cliente, só podem ser postergados, isto é, passar para uma data e um horário futuros e posteriores aos marcados. Se alterados pelo funcionário, podem ser adiantados ou postergados, sem ficar no passado enquanto o agendamento estiver “Agendado” e sem ser posteriores ao momento da alteração depois que o veículo chegou à empresa. Os valores são sempre calculados pelo sistema, sem informação manual: a troca do veículo ou dos serviços recalcula o valor de todos os serviços pelo catálogo atual, a troca da forma de pagamento aplica o percentual vigente, e o subtotal, o total, a duração estimada e a previsão de conclusão são recalculados (</w:t>
+              <w:t>).</w:t>
+            </w:r>
+            <w:r>
+              <w:t xml:space="preserve"> A data e o horário só são conferidos quando alterados: a edição que mantém a data e o horário marcados não os confere de novo, mesmo que já tenham passado ou que a disponibilidade tenha mudado.</w:t>
+            </w:r>
+            <w:r>
+              <w:t xml:space="preserve"> Se alterados pelo cliente, só podem ser postergados, isto é, passar para uma data e um horário futuros e posteriores aos marcados. Se alterados pelo funcionário, podem ser adiantados ou postergados, sem ficar no passado enquanto o agendamento estiver “Agendado” e sem ser posteriores ao momento da alteração depois que o veículo </w:t>
+            </w:r>
+            <w:r>
+              <w:t>chegou à empresa (“Em espera”, “Em execução”, “Finalizado”, “Concluído” e “Reagendado”). No agendamento “Cancelado”, vale só a disponibilidade.</w:t>
+            </w:r>
+            <w:r>
+              <w:t xml:space="preserve"> Os valores são sempre calculados pelo sistema, sem informação manual: a troca do veículo ou dos serviços recalcula o valor de todos os serviços pelo catálogo atual, a troca da forma de pagamento aplica o percentual vigente, e o subtotal, o total, a duração estimada e a previsão de conclusão são recalculados (</w:t>
             </w:r>
             <w:hyperlink w:anchor="RN034" w:history="1">
               <w:r>
@@ -17795,8 +17822,9 @@
       <w:pPr>
         <w:pStyle w:val="Ttulo2"/>
       </w:pPr>
-      <w:bookmarkStart w:id="197" w:name="_Toc242917922"/>
+      <w:bookmarkStart w:id="197" w:name="_Toc243436777"/>
       <w:r>
+        <w:lastRenderedPageBreak/>
         <w:t>Porte do Veículo</w:t>
       </w:r>
       <w:bookmarkEnd w:id="197"/>
@@ -18049,7 +18077,7 @@
       <w:pPr>
         <w:pStyle w:val="Ttulo2"/>
       </w:pPr>
-      <w:bookmarkStart w:id="198" w:name="_Toc242917923"/>
+      <w:bookmarkStart w:id="198" w:name="_Toc243436778"/>
       <w:r>
         <w:t>Ciclo de Vida do Agendamento</w:t>
       </w:r>
@@ -18534,7 +18562,7 @@
       <w:pPr>
         <w:pStyle w:val="Ttulo2"/>
       </w:pPr>
-      <w:bookmarkStart w:id="199" w:name="_Toc242917924"/>
+      <w:bookmarkStart w:id="199" w:name="_Toc243436779"/>
       <w:r>
         <w:t>Formato dos Dados</w:t>
       </w:r>
@@ -18576,7 +18604,11 @@
         <w:keepNext/>
       </w:pPr>
       <w:r>
-        <w:t>Em todos os campos de texto, são removidos os espaços no início e no fim, os espaços repetidos e os caracteres de controle, e o conteúdo é tratado como texto puro, sem interpretação de HTML.</w:t>
+        <w:t xml:space="preserve">Em todos os campos de texto, exceto a senha, a tabulação e a quebra de linha viram espaço, os demais caracteres de controle são removidos, o acento digitado como sinal separado é unido à letra (forma NFC do Unicode), e os espaços no início, </w:t>
+      </w:r>
+      <w:r>
+        <w:lastRenderedPageBreak/>
+        <w:t>no fim e repetidos são removidos. O conteúdo é tratado como texto puro, sem interpretação de HTML, e as descrições ficam em um único parágrafo.</w:t>
       </w:r>
     </w:p>
     <w:p>
@@ -18720,6 +18752,9 @@
             <w:r>
               <w:t>De 2 a 60 caracteres cada, com letras, inclusive acentuadas, espaço, hífen e apóstrofo. Cada palavra é gravada com a inicial maiúscula e as demais letras minúsculas; as partículas “da”, “de”, “do”, “das”, “dos” e “e” ficam em minúsculas.</w:t>
             </w:r>
+            <w:r>
+              <w:t xml:space="preserve"> A inicial também fica maiúscula depois do hífen e do apóstrofo (Ana-Maria, D'Ávila). Hífen e apóstrofo só aparecem entre letras, e o apóstrofo tipográfico (’) é gravado como '.</w:t>
+            </w:r>
           </w:p>
         </w:tc>
         <w:tc>
@@ -18894,7 +18929,10 @@
               <w:pStyle w:val="TextodeTabela"/>
             </w:pPr>
             <w:r>
-              <w:t>De 8 a 72 caracteres, com ao menos uma letra maiúscula, um número e um caractere especial (</w:t>
+              <w:t xml:space="preserve">De 8 a 72 caracteres, com ao menos </w:t>
+            </w:r>
+            <w:r>
+              <w:t>uma letra maiúscula, inclusive acentuada, um número e um caractere especial, que é qualquer caractere que não seja letra, número ou espaço (</w:t>
             </w:r>
             <w:hyperlink w:anchor="RS003" w:history="1">
               <w:r>
@@ -18907,6 +18945,29 @@
             <w:r>
               <w:t>).</w:t>
             </w:r>
+            <w:r>
+              <w:t xml:space="preserve"> É gravada como digitada, sem a normalização dos textos. O limite de 72 conta bytes em UTF-8, o limite do bcrypt: cada letra acentuada conta como dois. No </w:t>
+            </w:r>
+            <w:r>
+              <w:rPr>
+                <w:i/>
+              </w:rPr>
+              <w:t>login</w:t>
+            </w:r>
+            <w:r>
+              <w:t>, a senha só é obrigatória e limitada a 72 bytes; as regras de composição valem onde a senha é definida, para a senha fora delas receber a mesma resposta da senha errada (</w:t>
+            </w:r>
+            <w:hyperlink w:anchor="RS005" w:history="1">
+              <w:r>
+                <w:rPr>
+                  <w:rStyle w:val="Hyperlink"/>
+                </w:rPr>
+                <w:t>RS005</w:t>
+              </w:r>
+            </w:hyperlink>
+            <w:r>
+              <w:t>).</w:t>
+            </w:r>
           </w:p>
         </w:tc>
         <w:tc>
@@ -18993,7 +19054,10 @@
               <w:pStyle w:val="TextodeTabela"/>
             </w:pPr>
             <w:r>
-              <w:t>De 1 a 40 caracteres. A inicial de cada palavra é gravada em maiúscula, preservando as siglas digitadas em maiúsculas.</w:t>
+              <w:t xml:space="preserve">De 1 a 40 caracteres. A inicial de cada palavra é gravada em maiúscula, </w:t>
+            </w:r>
+            <w:r>
+              <w:t>e as demais letras ficam como digitadas, o que preserva as siglas.</w:t>
             </w:r>
           </w:p>
         </w:tc>
@@ -19068,6 +19132,7 @@
               <w:pStyle w:val="TextodeTabela"/>
             </w:pPr>
             <w:r>
+              <w:lastRenderedPageBreak/>
               <w:t>Ano do veículo</w:t>
             </w:r>
           </w:p>
@@ -19081,7 +19146,10 @@
               <w:pStyle w:val="TextodeTabela"/>
             </w:pPr>
             <w:r>
-              <w:t>Número inteiro de 1886, ano do primeiro automóvel, até o ano corrente.</w:t>
+              <w:t xml:space="preserve">Número inteiro de 1886, ano do primeiro automóvel, </w:t>
+            </w:r>
+            <w:r>
+              <w:t>até o ano seguinte ao corrente, para aceitar o ano-modelo de um veículo novo. O ano corrente é o do fuso da empresa.</w:t>
             </w:r>
           </w:p>
         </w:tc>
@@ -19226,7 +19294,7 @@
               <w:pStyle w:val="TextodeTabela"/>
             </w:pPr>
             <w:r>
-              <w:t>1 h 30 min</w:t>
+              <w:t>1 h 30 min; 45 min; 2 h</w:t>
             </w:r>
           </w:p>
         </w:tc>
@@ -19312,7 +19380,7 @@
               <w:pStyle w:val="TextodeTabela"/>
             </w:pPr>
             <w:r>
-              <w:t>Catorze algarismos, com dígitos verificadores válidos. Gravado apenas com os algarismos.</w:t>
+              <w:t>Catorze caracteres: os doze primeiros algarismos ou letras, já que a Receita Federal emite CNPJ alfanumérico desde julho de 2026, e os dois últimos algarismos, com dígitos verificadores válidos. Não pode ter os catorze caracteres iguais. Gravado sem a máscara, com as letras em maiúsculas.</w:t>
             </w:r>
           </w:p>
         </w:tc>
@@ -19325,7 +19393,7 @@
               <w:pStyle w:val="TextodeTabela"/>
             </w:pPr>
             <w:r>
-              <w:t>12.345.678/0001-90</w:t>
+              <w:t>12.345.678/0001-95</w:t>
             </w:r>
           </w:p>
         </w:tc>
@@ -19356,7 +19424,7 @@
               <w:pStyle w:val="TextodeTabela"/>
             </w:pPr>
             <w:r>
-              <w:t>Endereço iniciado por https:// e pertencente ao domínio da respectiva rede social.</w:t>
+              <w:t>Endereço iniciado por https://, no domínio da respectiva rede social (instagram.com ou facebook.com) ou num subdomínio dele, como www.instagram.com e m.facebook.com, seguido do caminho do perfil, com até 200 caracteres.</w:t>
             </w:r>
           </w:p>
         </w:tc>
@@ -19400,7 +19468,13 @@
               <w:pStyle w:val="TextodeTabela"/>
             </w:pPr>
             <w:r>
-              <w:t>De 2 a 60 caracteres, gravados com a inicial maiúscula. O nome não pode se repetir entre os serviços não excluídos, entre as categorias nem entre os cargos.</w:t>
+              <w:t xml:space="preserve">De 2 a 60 caracteres, </w:t>
+            </w:r>
+            <w:r>
+              <w:t>gravados com a inicial maiúscula e as demais letras como digitadas.</w:t>
+            </w:r>
+            <w:r>
+              <w:t xml:space="preserve"> O nome não pode se repetir entre os serviços não excluídos, entre as categorias nem entre os cargos.</w:t>
             </w:r>
           </w:p>
         </w:tc>
@@ -19444,7 +19518,10 @@
               <w:pStyle w:val="TextodeTabela"/>
             </w:pPr>
             <w:r>
-              <w:t>De 2 a 60 caracteres, gravada com a inicial maiúscula.</w:t>
+              <w:t xml:space="preserve">De 2 a 60 caracteres, </w:t>
+            </w:r>
+            <w:r>
+              <w:t>gravada com a inicial maiúscula e as demais letras como digitadas.</w:t>
             </w:r>
           </w:p>
         </w:tc>
@@ -19653,7 +19730,20 @@
         <w:spacing w:before="240"/>
       </w:pPr>
       <w:r>
+        <w:lastRenderedPageBreak/>
+        <w:t>DDD válido é um dos 67 códigos nacionais da Anatel: 11 a 19, 21, 22, 24, 27, 28, 31 a 35, 37, 38, 41 a 49, 51, 53 a 55, 61 a 69, 71, 73 a 75, 77, 79, 81 a 89 e 91 a 99. Na digitação, são aceitos e removidos os parênteses, os espaços, os hífens e os pontos dos telefones, e os pontos, a barra e o hífen do CNPJ. O código do país (+55) não é aceito.</w:t>
+      </w:r>
+    </w:p>
+    <w:p>
+      <w:pPr>
+        <w:pStyle w:val="Texto"/>
+        <w:keepNext/>
+      </w:pPr>
+      <w:r>
         <w:t>O Quadro 24 relaciona, para cada cadastro, as informações obrigatórias e as opcionais. Um cadastro só é gravado quando todas as obrigatórias estão presentes e válidas.</w:t>
+      </w:r>
+      <w:r>
+        <w:t xml:space="preserve"> Uma opcional deixada vazia fica sem valor, e o valor que estava gravado é apagado.</w:t>
       </w:r>
     </w:p>
     <w:p>
@@ -20390,8 +20480,9 @@
       <w:pPr>
         <w:pStyle w:val="Ttulo1"/>
       </w:pPr>
-      <w:bookmarkStart w:id="200" w:name="_Toc242917925"/>
+      <w:bookmarkStart w:id="200" w:name="_Toc243436780"/>
       <w:r>
+        <w:lastRenderedPageBreak/>
         <w:t>CASOS DE USO</w:t>
       </w:r>
       <w:bookmarkEnd w:id="200"/>
@@ -20408,7 +20499,7 @@
       <w:pPr>
         <w:pStyle w:val="Ttulo2"/>
       </w:pPr>
-      <w:bookmarkStart w:id="201" w:name="_Toc242917926"/>
+      <w:bookmarkStart w:id="201" w:name="_Toc243436781"/>
       <w:r>
         <w:t>Visão Geral dos Casos de Uso</w:t>
       </w:r>
@@ -23086,7 +23177,7 @@
       <w:pPr>
         <w:pStyle w:val="Ttulo2"/>
       </w:pPr>
-      <w:bookmarkStart w:id="202" w:name="_Toc242917927"/>
+      <w:bookmarkStart w:id="202" w:name="_Toc243436782"/>
       <w:r>
         <w:t>Especificação dos Casos de Uso</w:t>
       </w:r>
@@ -23547,7 +23638,10 @@
             </w:r>
             <w:r>
               <w:tab/>
-              <w:t>O cliente autenticado acessa as páginas públicas da mesma forma, com a barra de navegação exibindo também as opções restritas ao cliente.</w:t>
+              <w:t xml:space="preserve">O cliente autenticado acessa as páginas públicas da mesma forma, com a barra de navegação </w:t>
+            </w:r>
+            <w:r>
+              <w:t>exibindo também as opções restritas ao cliente (Agendar, Meus agendamentos e Minha conta) e a opção de sair.</w:t>
             </w:r>
           </w:p>
         </w:tc>
@@ -23614,6 +23708,7 @@
                 <w:b/>
                 <w:bCs/>
               </w:rPr>
+              <w:lastRenderedPageBreak/>
               <w:t>FE02 – Falha ao carregar os dados (passos 2 ou 4)</w:t>
             </w:r>
           </w:p>
@@ -23641,6 +23736,7 @@
         <w:pStyle w:val="Legenda"/>
       </w:pPr>
       <w:r>
+        <w:lastRenderedPageBreak/>
         <w:t xml:space="preserve">Quadro </w:t>
       </w:r>
       <w:fldSimple w:instr=" SEQ Quadro \* ARABIC ">
@@ -24636,11 +24732,15 @@
               <w:ind w:left="397" w:hanging="397"/>
             </w:pPr>
             <w:r>
+              <w:lastRenderedPageBreak/>
               <w:t>5.</w:t>
             </w:r>
             <w:r>
               <w:tab/>
-              <w:t>O sistema inicia a sessão, identifica o perfil da conta e exibe a área restrita ao cliente (</w:t>
+              <w:t xml:space="preserve">O sistema inicia a sessão, identifica o perfil da conta e </w:t>
+            </w:r>
+            <w:r>
+              <w:t>exibe a página inicial do portal, com as opções restritas ao cliente (</w:t>
             </w:r>
             <w:hyperlink w:anchor="RS007" w:history="1">
               <w:r>
@@ -24682,6 +24782,7 @@
                 <w:b/>
                 <w:bCs/>
               </w:rPr>
+              <w:lastRenderedPageBreak/>
               <w:t>Fluxos alternativos</w:t>
             </w:r>
           </w:p>
@@ -24886,7 +24987,9 @@
             </w:r>
             <w:r>
               <w:tab/>
-              <w:t>O cliente informa a nova senha e confirma.</w:t>
+            </w:r>
+            <w:r>
+              <w:t>O cliente informa a senha inicial e a nova senha e confirma.</w:t>
             </w:r>
           </w:p>
           <w:p>
@@ -25539,6 +25642,7 @@
               <w:ind w:left="397" w:hanging="397"/>
             </w:pPr>
             <w:r>
+              <w:lastRenderedPageBreak/>
               <w:t>4.</w:t>
             </w:r>
             <w:r>
@@ -25582,6 +25686,7 @@
                 <w:b/>
                 <w:bCs/>
               </w:rPr>
+              <w:lastRenderedPageBreak/>
               <w:t>Fluxos alternativos</w:t>
             </w:r>
           </w:p>
@@ -26404,6 +26509,7 @@
                 <w:b/>
                 <w:bCs/>
               </w:rPr>
+              <w:lastRenderedPageBreak/>
               <w:t>Fluxos de exceção</w:t>
             </w:r>
           </w:p>
@@ -27200,6 +27306,7 @@
                 <w:b/>
                 <w:bCs/>
               </w:rPr>
+              <w:lastRenderedPageBreak/>
               <w:t>Fluxos alternativos</w:t>
             </w:r>
           </w:p>
@@ -28040,6 +28147,7 @@
                 <w:b/>
                 <w:bCs/>
               </w:rPr>
+              <w:lastRenderedPageBreak/>
               <w:t>FA03 – Edição de agendamento (passo 2)</w:t>
             </w:r>
           </w:p>
@@ -28087,6 +28195,7 @@
                 <w:b/>
                 <w:bCs/>
               </w:rPr>
+              <w:lastRenderedPageBreak/>
               <w:t>Fluxos de exceção</w:t>
             </w:r>
           </w:p>
@@ -28682,7 +28791,9 @@
             </w:r>
             <w:r>
               <w:tab/>
-              <w:t>O funcionário informa a nova senha e confirma.</w:t>
+            </w:r>
+            <w:r>
+              <w:t>O funcionário informa a senha inicial e a nova senha e confirma.</w:t>
             </w:r>
           </w:p>
           <w:p>
@@ -28949,7 +29060,10 @@
             </w:r>
             <w:r>
               <w:tab/>
-              <w:t>O funcionário tenta acessar uma página não permitida pelo seu cargo; o sistema nega o acesso e informa a restrição (</w:t>
+              <w:t xml:space="preserve">O funcionário tenta acessar uma página não permitida pelo seu cargo; o sistema </w:t>
+            </w:r>
+            <w:r>
+              <w:t>nega o acesso, exibe a primeira página permitida e informa a restrição (</w:t>
             </w:r>
             <w:hyperlink w:anchor="RS008" w:history="1">
               <w:r>
@@ -28960,6 +29074,17 @@
               </w:r>
             </w:hyperlink>
             <w:r>
+              <w:t xml:space="preserve">, </w:t>
+            </w:r>
+            <w:hyperlink w:anchor="RN025" w:history="1">
+              <w:r>
+                <w:rPr>
+                  <w:rStyle w:val="Hyperlink"/>
+                </w:rPr>
+                <w:t>RN025</w:t>
+              </w:r>
+            </w:hyperlink>
+            <w:r>
               <w:t>).</w:t>
             </w:r>
           </w:p>
@@ -28973,6 +29098,7 @@
                 <w:b/>
                 <w:bCs/>
               </w:rPr>
+              <w:lastRenderedPageBreak/>
               <w:t>FE04 – Nova senha inválida (FA01)</w:t>
             </w:r>
           </w:p>
@@ -29000,6 +29126,7 @@
         <w:pStyle w:val="Legenda"/>
       </w:pPr>
       <w:r>
+        <w:lastRenderedPageBreak/>
         <w:t xml:space="preserve">Quadro </w:t>
       </w:r>
       <w:fldSimple w:instr=" SEQ Quadro \* ARABIC ">
@@ -29939,6 +30066,7 @@
                 <w:b/>
                 <w:bCs/>
               </w:rPr>
+              <w:lastRenderedPageBreak/>
               <w:t>Fluxos alternativos</w:t>
             </w:r>
           </w:p>
@@ -30724,6 +30852,7 @@
               <w:ind w:left="397" w:hanging="397"/>
             </w:pPr>
             <w:r>
+              <w:lastRenderedPageBreak/>
               <w:t>8.</w:t>
             </w:r>
             <w:r>
@@ -30748,6 +30877,7 @@
                 <w:b/>
                 <w:bCs/>
               </w:rPr>
+              <w:lastRenderedPageBreak/>
               <w:t>Fluxos alternativos</w:t>
             </w:r>
           </w:p>
@@ -31562,6 +31692,7 @@
                 <w:b/>
                 <w:bCs/>
               </w:rPr>
+              <w:lastRenderedPageBreak/>
               <w:t>FA02 – Cancelamento do agendamento (passo 2)</w:t>
             </w:r>
           </w:p>
@@ -31644,6 +31775,7 @@
                 <w:b/>
                 <w:bCs/>
               </w:rPr>
+              <w:lastRenderedPageBreak/>
               <w:t>Fluxos de exceção</w:t>
             </w:r>
           </w:p>
@@ -32331,6 +32463,7 @@
               <w:ind w:left="397" w:hanging="397"/>
             </w:pPr>
             <w:r>
+              <w:lastRenderedPageBreak/>
               <w:t>3.</w:t>
             </w:r>
             <w:r>
@@ -32355,6 +32488,7 @@
                 <w:b/>
                 <w:bCs/>
               </w:rPr>
+              <w:lastRenderedPageBreak/>
               <w:t>Fluxos de exceção</w:t>
             </w:r>
           </w:p>
@@ -33138,6 +33272,7 @@
                 <w:b/>
                 <w:bCs/>
               </w:rPr>
+              <w:lastRenderedPageBreak/>
               <w:t>Fluxos de exceção</w:t>
             </w:r>
           </w:p>
@@ -33863,6 +33998,7 @@
         <w:pStyle w:val="Legenda"/>
       </w:pPr>
       <w:r>
+        <w:lastRenderedPageBreak/>
         <w:t xml:space="preserve">Quadro </w:t>
       </w:r>
       <w:fldSimple w:instr=" SEQ Quadro \* ARABIC ">
@@ -34882,6 +35018,7 @@
               <w:ind w:left="397" w:hanging="397"/>
             </w:pPr>
             <w:r>
+              <w:lastRenderedPageBreak/>
               <w:t>2.</w:t>
             </w:r>
             <w:r>
@@ -34957,6 +35094,7 @@
                 <w:b/>
                 <w:bCs/>
               </w:rPr>
+              <w:lastRenderedPageBreak/>
               <w:t>Fluxos de exceção</w:t>
             </w:r>
           </w:p>
@@ -35661,6 +35799,7 @@
               <w:ind w:left="397" w:hanging="397"/>
             </w:pPr>
             <w:r>
+              <w:lastRenderedPageBreak/>
               <w:t>4.</w:t>
             </w:r>
             <w:r>
@@ -35707,6 +35846,7 @@
                 <w:b/>
                 <w:bCs/>
               </w:rPr>
+              <w:lastRenderedPageBreak/>
               <w:t>Fluxos de exceção</w:t>
             </w:r>
           </w:p>
@@ -36426,6 +36566,7 @@
         <w:pStyle w:val="Legenda"/>
       </w:pPr>
       <w:r>
+        <w:lastRenderedPageBreak/>
         <w:t xml:space="preserve">Quadro </w:t>
       </w:r>
       <w:fldSimple w:instr=" SEQ Quadro \* ARABIC ">
@@ -37419,6 +37560,7 @@
               <w:ind w:left="397" w:hanging="397"/>
             </w:pPr>
             <w:r>
+              <w:lastRenderedPageBreak/>
               <w:t>6.</w:t>
             </w:r>
             <w:r>
@@ -37486,6 +37628,7 @@
                 <w:b/>
                 <w:bCs/>
               </w:rPr>
+              <w:lastRenderedPageBreak/>
               <w:t>Fluxos alternativos</w:t>
             </w:r>
           </w:p>
@@ -38274,7 +38417,24 @@
             </w:r>
             <w:r>
               <w:tab/>
-              <w:t>O sistema indica os campos com problema, como CNPJ ou e-mail em formato inválido, e o fluxo retorna ao passo 5.</w:t>
+              <w:t>O sistema indica os campos com problema, como CNPJ ou e-mail em formato inválido</w:t>
+            </w:r>
+            <w:r>
+              <w:t xml:space="preserve"> (</w:t>
+            </w:r>
+            <w:hyperlink w:anchor="RN035" w:history="1">
+              <w:r>
+                <w:rPr>
+                  <w:rStyle w:val="Hyperlink"/>
+                </w:rPr>
+                <w:t>RN035</w:t>
+              </w:r>
+            </w:hyperlink>
+            <w:r>
+              <w:t>)</w:t>
+            </w:r>
+            <w:r>
+              <w:t>, e o fluxo retorna ao passo 5.</w:t>
             </w:r>
           </w:p>
         </w:tc>
@@ -38285,6 +38445,7 @@
         <w:pStyle w:val="Legenda"/>
       </w:pPr>
       <w:r>
+        <w:lastRenderedPageBreak/>
         <w:t xml:space="preserve">Quadro </w:t>
       </w:r>
       <w:fldSimple w:instr=" SEQ Quadro \* ARABIC ">
@@ -39207,6 +39368,7 @@
                 <w:b/>
                 <w:bCs/>
               </w:rPr>
+              <w:lastRenderedPageBreak/>
               <w:t>Fluxos alternativos</w:t>
             </w:r>
           </w:p>
@@ -40028,6 +40190,7 @@
                 <w:b/>
                 <w:bCs/>
               </w:rPr>
+              <w:lastRenderedPageBreak/>
               <w:t>FE03 – Data ou horário inválido (passo 7)</w:t>
             </w:r>
           </w:p>
@@ -40077,6 +40240,7 @@
         <w:pStyle w:val="Legenda"/>
       </w:pPr>
       <w:r>
+        <w:lastRenderedPageBreak/>
         <w:t xml:space="preserve">Quadro </w:t>
       </w:r>
       <w:fldSimple w:instr=" SEQ Quadro \* ARABIC ">
@@ -40809,6 +40973,7 @@
                 <w:b/>
                 <w:bCs/>
               </w:rPr>
+              <w:lastRenderedPageBreak/>
               <w:t>FE03 – Composição inválida (passo 7)</w:t>
             </w:r>
           </w:p>
@@ -42178,6 +42343,18 @@
       <w:szCs w:val="18"/>
     </w:rPr>
   </w:style>
+  <w:style w:type="character" w:styleId="MenoPendente">
+    <w:name w:val="Unresolved Mention"/>
+    <w:basedOn w:val="Fontepargpadro"/>
+    <w:uiPriority w:val="99"/>
+    <w:semiHidden/>
+    <w:unhideWhenUsed/>
+    <w:rsid w:val="00850FF2"/>
+    <w:rPr>
+      <w:color w:val="605E5C"/>
+      <w:shd w:val="clear" w:color="auto" w:fill="E1DFDD"/>
+    </w:rPr>
+  </w:style>
 </w:styles>
 </file>
 

</xml_diff>

<commit_message>
docs: update the formal documents after #21 to #26 and #35 to #37 (#55)
Co-authored-by: Claude Opus 5.5 <noreply@anthropic.com>
</commit_message>
<xml_diff>
--- a/documentos-formais/AnaliseDoSistema.docx
+++ b/documentos-formais/AnaliseDoSistema.docx
@@ -240,7 +240,7 @@
       <w:r>
         <w:fldChar w:fldCharType="separate"/>
       </w:r>
-      <w:hyperlink w:anchor="_Toc242917884" w:history="1">
+      <w:hyperlink w:anchor="_Toc243436739" w:history="1">
         <w:r>
           <w:rPr>
             <w:rStyle w:val="Hyperlink"/>
@@ -263,7 +263,7 @@
           <w:rPr>
             <w:webHidden/>
           </w:rPr>
-          <w:instrText xml:space="preserve"> PAGEREF _Toc242917884 \h </w:instrText>
+          <w:instrText xml:space="preserve"> PAGEREF _Toc243436739 \h </w:instrText>
         </w:r>
         <w:r>
           <w:rPr>
@@ -298,7 +298,7 @@
           <w:lang w:eastAsia="pt-BR"/>
         </w:rPr>
       </w:pPr>
-      <w:hyperlink w:anchor="_Toc242917885" w:history="1">
+      <w:hyperlink w:anchor="_Toc243436740" w:history="1">
         <w:r>
           <w:rPr>
             <w:rStyle w:val="Hyperlink"/>
@@ -321,7 +321,7 @@
           <w:rPr>
             <w:webHidden/>
           </w:rPr>
-          <w:instrText xml:space="preserve"> PAGEREF _Toc242917885 \h </w:instrText>
+          <w:instrText xml:space="preserve"> PAGEREF _Toc243436740 \h </w:instrText>
         </w:r>
         <w:r>
           <w:rPr>
@@ -356,7 +356,7 @@
           <w:lang w:eastAsia="pt-BR"/>
         </w:rPr>
       </w:pPr>
-      <w:hyperlink w:anchor="_Toc242917886" w:history="1">
+      <w:hyperlink w:anchor="_Toc243436741" w:history="1">
         <w:r>
           <w:rPr>
             <w:rStyle w:val="Hyperlink"/>
@@ -379,7 +379,7 @@
           <w:rPr>
             <w:webHidden/>
           </w:rPr>
-          <w:instrText xml:space="preserve"> PAGEREF _Toc242917886 \h </w:instrText>
+          <w:instrText xml:space="preserve"> PAGEREF _Toc243436741 \h </w:instrText>
         </w:r>
         <w:r>
           <w:rPr>
@@ -414,7 +414,7 @@
           <w:lang w:eastAsia="pt-BR"/>
         </w:rPr>
       </w:pPr>
-      <w:hyperlink w:anchor="_Toc242917887" w:history="1">
+      <w:hyperlink w:anchor="_Toc243436742" w:history="1">
         <w:r>
           <w:rPr>
             <w:rStyle w:val="Hyperlink"/>
@@ -437,7 +437,7 @@
           <w:rPr>
             <w:webHidden/>
           </w:rPr>
-          <w:instrText xml:space="preserve"> PAGEREF _Toc242917887 \h </w:instrText>
+          <w:instrText xml:space="preserve"> PAGEREF _Toc243436742 \h </w:instrText>
         </w:r>
         <w:r>
           <w:rPr>
@@ -472,7 +472,7 @@
           <w:lang w:eastAsia="pt-BR"/>
         </w:rPr>
       </w:pPr>
-      <w:hyperlink w:anchor="_Toc242917888" w:history="1">
+      <w:hyperlink w:anchor="_Toc243436743" w:history="1">
         <w:r>
           <w:rPr>
             <w:rStyle w:val="Hyperlink"/>
@@ -495,7 +495,7 @@
           <w:rPr>
             <w:webHidden/>
           </w:rPr>
-          <w:instrText xml:space="preserve"> PAGEREF _Toc242917888 \h </w:instrText>
+          <w:instrText xml:space="preserve"> PAGEREF _Toc243436743 \h </w:instrText>
         </w:r>
         <w:r>
           <w:rPr>
@@ -532,7 +532,7 @@
           <w:lang w:eastAsia="pt-BR"/>
         </w:rPr>
       </w:pPr>
-      <w:hyperlink w:anchor="_Toc242917889" w:history="1">
+      <w:hyperlink w:anchor="_Toc243436744" w:history="1">
         <w:r>
           <w:rPr>
             <w:rStyle w:val="Hyperlink"/>
@@ -555,7 +555,7 @@
           <w:rPr>
             <w:webHidden/>
           </w:rPr>
-          <w:instrText xml:space="preserve"> PAGEREF _Toc242917889 \h </w:instrText>
+          <w:instrText xml:space="preserve"> PAGEREF _Toc243436744 \h </w:instrText>
         </w:r>
         <w:r>
           <w:rPr>
@@ -590,7 +590,7 @@
           <w:lang w:eastAsia="pt-BR"/>
         </w:rPr>
       </w:pPr>
-      <w:hyperlink w:anchor="_Toc242917890" w:history="1">
+      <w:hyperlink w:anchor="_Toc243436745" w:history="1">
         <w:r>
           <w:rPr>
             <w:rStyle w:val="Hyperlink"/>
@@ -613,7 +613,7 @@
           <w:rPr>
             <w:webHidden/>
           </w:rPr>
-          <w:instrText xml:space="preserve"> PAGEREF _Toc242917890 \h </w:instrText>
+          <w:instrText xml:space="preserve"> PAGEREF _Toc243436745 \h </w:instrText>
         </w:r>
         <w:r>
           <w:rPr>
@@ -648,7 +648,7 @@
           <w:lang w:eastAsia="pt-BR"/>
         </w:rPr>
       </w:pPr>
-      <w:hyperlink w:anchor="_Toc242917891" w:history="1">
+      <w:hyperlink w:anchor="_Toc243436746" w:history="1">
         <w:r>
           <w:rPr>
             <w:rStyle w:val="Hyperlink"/>
@@ -671,7 +671,7 @@
           <w:rPr>
             <w:webHidden/>
           </w:rPr>
-          <w:instrText xml:space="preserve"> PAGEREF _Toc242917891 \h </w:instrText>
+          <w:instrText xml:space="preserve"> PAGEREF _Toc243436746 \h </w:instrText>
         </w:r>
         <w:r>
           <w:rPr>
@@ -708,7 +708,7 @@
           <w:lang w:eastAsia="pt-BR"/>
         </w:rPr>
       </w:pPr>
-      <w:hyperlink w:anchor="_Toc242917892" w:history="1">
+      <w:hyperlink w:anchor="_Toc243436747" w:history="1">
         <w:r>
           <w:rPr>
             <w:rStyle w:val="Hyperlink"/>
@@ -731,7 +731,7 @@
           <w:rPr>
             <w:webHidden/>
           </w:rPr>
-          <w:instrText xml:space="preserve"> PAGEREF _Toc242917892 \h </w:instrText>
+          <w:instrText xml:space="preserve"> PAGEREF _Toc243436747 \h </w:instrText>
         </w:r>
         <w:r>
           <w:rPr>
@@ -766,7 +766,7 @@
           <w:lang w:eastAsia="pt-BR"/>
         </w:rPr>
       </w:pPr>
-      <w:hyperlink w:anchor="_Toc242917893" w:history="1">
+      <w:hyperlink w:anchor="_Toc243436748" w:history="1">
         <w:r>
           <w:rPr>
             <w:rStyle w:val="Hyperlink"/>
@@ -789,7 +789,7 @@
           <w:rPr>
             <w:webHidden/>
           </w:rPr>
-          <w:instrText xml:space="preserve"> PAGEREF _Toc242917893 \h </w:instrText>
+          <w:instrText xml:space="preserve"> PAGEREF _Toc243436748 \h </w:instrText>
         </w:r>
         <w:r>
           <w:rPr>
@@ -824,7 +824,7 @@
           <w:lang w:eastAsia="pt-BR"/>
         </w:rPr>
       </w:pPr>
-      <w:hyperlink w:anchor="_Toc242917894" w:history="1">
+      <w:hyperlink w:anchor="_Toc243436749" w:history="1">
         <w:r>
           <w:rPr>
             <w:rStyle w:val="Hyperlink"/>
@@ -847,7 +847,7 @@
           <w:rPr>
             <w:webHidden/>
           </w:rPr>
-          <w:instrText xml:space="preserve"> PAGEREF _Toc242917894 \h </w:instrText>
+          <w:instrText xml:space="preserve"> PAGEREF _Toc243436749 \h </w:instrText>
         </w:r>
         <w:r>
           <w:rPr>
@@ -882,7 +882,7 @@
           <w:lang w:eastAsia="pt-BR"/>
         </w:rPr>
       </w:pPr>
-      <w:hyperlink w:anchor="_Toc242917895" w:history="1">
+      <w:hyperlink w:anchor="_Toc243436750" w:history="1">
         <w:r>
           <w:rPr>
             <w:rStyle w:val="Hyperlink"/>
@@ -905,7 +905,7 @@
           <w:rPr>
             <w:webHidden/>
           </w:rPr>
-          <w:instrText xml:space="preserve"> PAGEREF _Toc242917895 \h </w:instrText>
+          <w:instrText xml:space="preserve"> PAGEREF _Toc243436750 \h </w:instrText>
         </w:r>
         <w:r>
           <w:rPr>
@@ -940,7 +940,7 @@
           <w:lang w:eastAsia="pt-BR"/>
         </w:rPr>
       </w:pPr>
-      <w:hyperlink w:anchor="_Toc242917896" w:history="1">
+      <w:hyperlink w:anchor="_Toc243436751" w:history="1">
         <w:r>
           <w:rPr>
             <w:rStyle w:val="Hyperlink"/>
@@ -963,7 +963,7 @@
           <w:rPr>
             <w:webHidden/>
           </w:rPr>
-          <w:instrText xml:space="preserve"> PAGEREF _Toc242917896 \h </w:instrText>
+          <w:instrText xml:space="preserve"> PAGEREF _Toc243436751 \h </w:instrText>
         </w:r>
         <w:r>
           <w:rPr>
@@ -998,7 +998,7 @@
           <w:lang w:eastAsia="pt-BR"/>
         </w:rPr>
       </w:pPr>
-      <w:hyperlink w:anchor="_Toc242917897" w:history="1">
+      <w:hyperlink w:anchor="_Toc243436752" w:history="1">
         <w:r>
           <w:rPr>
             <w:rStyle w:val="Hyperlink"/>
@@ -1021,7 +1021,7 @@
           <w:rPr>
             <w:webHidden/>
           </w:rPr>
-          <w:instrText xml:space="preserve"> PAGEREF _Toc242917897 \h </w:instrText>
+          <w:instrText xml:space="preserve"> PAGEREF _Toc243436752 \h </w:instrText>
         </w:r>
         <w:r>
           <w:rPr>
@@ -1056,7 +1056,7 @@
           <w:lang w:eastAsia="pt-BR"/>
         </w:rPr>
       </w:pPr>
-      <w:hyperlink w:anchor="_Toc242917898" w:history="1">
+      <w:hyperlink w:anchor="_Toc243436753" w:history="1">
         <w:r>
           <w:rPr>
             <w:rStyle w:val="Hyperlink"/>
@@ -1079,7 +1079,7 @@
           <w:rPr>
             <w:webHidden/>
           </w:rPr>
-          <w:instrText xml:space="preserve"> PAGEREF _Toc242917898 \h </w:instrText>
+          <w:instrText xml:space="preserve"> PAGEREF _Toc243436753 \h </w:instrText>
         </w:r>
         <w:r>
           <w:rPr>
@@ -1116,7 +1116,7 @@
           <w:lang w:eastAsia="pt-BR"/>
         </w:rPr>
       </w:pPr>
-      <w:hyperlink w:anchor="_Toc242917899" w:history="1">
+      <w:hyperlink w:anchor="_Toc243436754" w:history="1">
         <w:r>
           <w:rPr>
             <w:rStyle w:val="Hyperlink"/>
@@ -1139,7 +1139,7 @@
           <w:rPr>
             <w:webHidden/>
           </w:rPr>
-          <w:instrText xml:space="preserve"> PAGEREF _Toc242917899 \h </w:instrText>
+          <w:instrText xml:space="preserve"> PAGEREF _Toc243436754 \h </w:instrText>
         </w:r>
         <w:r>
           <w:rPr>
@@ -1174,7 +1174,7 @@
           <w:lang w:eastAsia="pt-BR"/>
         </w:rPr>
       </w:pPr>
-      <w:hyperlink w:anchor="_Toc242917900" w:history="1">
+      <w:hyperlink w:anchor="_Toc243436755" w:history="1">
         <w:r>
           <w:rPr>
             <w:rStyle w:val="Hyperlink"/>
@@ -1197,7 +1197,7 @@
           <w:rPr>
             <w:webHidden/>
           </w:rPr>
-          <w:instrText xml:space="preserve"> PAGEREF _Toc242917900 \h </w:instrText>
+          <w:instrText xml:space="preserve"> PAGEREF _Toc243436755 \h </w:instrText>
         </w:r>
         <w:r>
           <w:rPr>
@@ -1232,7 +1232,7 @@
           <w:lang w:eastAsia="pt-BR"/>
         </w:rPr>
       </w:pPr>
-      <w:hyperlink w:anchor="_Toc242917901" w:history="1">
+      <w:hyperlink w:anchor="_Toc243436756" w:history="1">
         <w:r>
           <w:rPr>
             <w:rStyle w:val="Hyperlink"/>
@@ -1255,7 +1255,7 @@
           <w:rPr>
             <w:webHidden/>
           </w:rPr>
-          <w:instrText xml:space="preserve"> PAGEREF _Toc242917901 \h </w:instrText>
+          <w:instrText xml:space="preserve"> PAGEREF _Toc243436756 \h </w:instrText>
         </w:r>
         <w:r>
           <w:rPr>
@@ -1292,7 +1292,7 @@
           <w:lang w:eastAsia="pt-BR"/>
         </w:rPr>
       </w:pPr>
-      <w:hyperlink w:anchor="_Toc242917902" w:history="1">
+      <w:hyperlink w:anchor="_Toc243436757" w:history="1">
         <w:r>
           <w:rPr>
             <w:rStyle w:val="Hyperlink"/>
@@ -1315,7 +1315,7 @@
           <w:rPr>
             <w:webHidden/>
           </w:rPr>
-          <w:instrText xml:space="preserve"> PAGEREF _Toc242917902 \h </w:instrText>
+          <w:instrText xml:space="preserve"> PAGEREF _Toc243436757 \h </w:instrText>
         </w:r>
         <w:r>
           <w:rPr>
@@ -1352,7 +1352,7 @@
           <w:lang w:eastAsia="pt-BR"/>
         </w:rPr>
       </w:pPr>
-      <w:hyperlink w:anchor="_Toc242917903" w:history="1">
+      <w:hyperlink w:anchor="_Toc243436758" w:history="1">
         <w:r>
           <w:rPr>
             <w:rStyle w:val="Hyperlink"/>
@@ -1375,7 +1375,7 @@
           <w:rPr>
             <w:webHidden/>
           </w:rPr>
-          <w:instrText xml:space="preserve"> PAGEREF _Toc242917903 \h </w:instrText>
+          <w:instrText xml:space="preserve"> PAGEREF _Toc243436758 \h </w:instrText>
         </w:r>
         <w:r>
           <w:rPr>
@@ -1410,7 +1410,7 @@
           <w:lang w:eastAsia="pt-BR"/>
         </w:rPr>
       </w:pPr>
-      <w:hyperlink w:anchor="_Toc242917904" w:history="1">
+      <w:hyperlink w:anchor="_Toc243436759" w:history="1">
         <w:r>
           <w:rPr>
             <w:rStyle w:val="Hyperlink"/>
@@ -1433,7 +1433,7 @@
           <w:rPr>
             <w:webHidden/>
           </w:rPr>
-          <w:instrText xml:space="preserve"> PAGEREF _Toc242917904 \h </w:instrText>
+          <w:instrText xml:space="preserve"> PAGEREF _Toc243436759 \h </w:instrText>
         </w:r>
         <w:r>
           <w:rPr>
@@ -1468,7 +1468,7 @@
           <w:lang w:eastAsia="pt-BR"/>
         </w:rPr>
       </w:pPr>
-      <w:hyperlink w:anchor="_Toc242917905" w:history="1">
+      <w:hyperlink w:anchor="_Toc243436760" w:history="1">
         <w:r>
           <w:rPr>
             <w:rStyle w:val="Hyperlink"/>
@@ -1491,7 +1491,7 @@
           <w:rPr>
             <w:webHidden/>
           </w:rPr>
-          <w:instrText xml:space="preserve"> PAGEREF _Toc242917905 \h </w:instrText>
+          <w:instrText xml:space="preserve"> PAGEREF _Toc243436760 \h </w:instrText>
         </w:r>
         <w:r>
           <w:rPr>
@@ -1526,7 +1526,7 @@
           <w:lang w:eastAsia="pt-BR"/>
         </w:rPr>
       </w:pPr>
-      <w:hyperlink w:anchor="_Toc242917906" w:history="1">
+      <w:hyperlink w:anchor="_Toc243436761" w:history="1">
         <w:r>
           <w:rPr>
             <w:rStyle w:val="Hyperlink"/>
@@ -1549,7 +1549,7 @@
           <w:rPr>
             <w:webHidden/>
           </w:rPr>
-          <w:instrText xml:space="preserve"> PAGEREF _Toc242917906 \h </w:instrText>
+          <w:instrText xml:space="preserve"> PAGEREF _Toc243436761 \h </w:instrText>
         </w:r>
         <w:r>
           <w:rPr>
@@ -1584,7 +1584,7 @@
           <w:lang w:eastAsia="pt-BR"/>
         </w:rPr>
       </w:pPr>
-      <w:hyperlink w:anchor="_Toc242917907" w:history="1">
+      <w:hyperlink w:anchor="_Toc243436762" w:history="1">
         <w:r>
           <w:rPr>
             <w:rStyle w:val="Hyperlink"/>
@@ -1607,7 +1607,7 @@
           <w:rPr>
             <w:webHidden/>
           </w:rPr>
-          <w:instrText xml:space="preserve"> PAGEREF _Toc242917907 \h </w:instrText>
+          <w:instrText xml:space="preserve"> PAGEREF _Toc243436762 \h </w:instrText>
         </w:r>
         <w:r>
           <w:rPr>
@@ -1642,7 +1642,7 @@
           <w:lang w:eastAsia="pt-BR"/>
         </w:rPr>
       </w:pPr>
-      <w:hyperlink w:anchor="_Toc242917908" w:history="1">
+      <w:hyperlink w:anchor="_Toc243436763" w:history="1">
         <w:r>
           <w:rPr>
             <w:rStyle w:val="Hyperlink"/>
@@ -1665,7 +1665,7 @@
           <w:rPr>
             <w:webHidden/>
           </w:rPr>
-          <w:instrText xml:space="preserve"> PAGEREF _Toc242917908 \h </w:instrText>
+          <w:instrText xml:space="preserve"> PAGEREF _Toc243436763 \h </w:instrText>
         </w:r>
         <w:r>
           <w:rPr>
@@ -1700,7 +1700,7 @@
           <w:lang w:eastAsia="pt-BR"/>
         </w:rPr>
       </w:pPr>
-      <w:hyperlink w:anchor="_Toc242917909" w:history="1">
+      <w:hyperlink w:anchor="_Toc243436764" w:history="1">
         <w:r>
           <w:rPr>
             <w:rStyle w:val="Hyperlink"/>
@@ -1723,7 +1723,7 @@
           <w:rPr>
             <w:webHidden/>
           </w:rPr>
-          <w:instrText xml:space="preserve"> PAGEREF _Toc242917909 \h </w:instrText>
+          <w:instrText xml:space="preserve"> PAGEREF _Toc243436764 \h </w:instrText>
         </w:r>
         <w:r>
           <w:rPr>
@@ -1758,7 +1758,7 @@
           <w:lang w:eastAsia="pt-BR"/>
         </w:rPr>
       </w:pPr>
-      <w:hyperlink w:anchor="_Toc242917910" w:history="1">
+      <w:hyperlink w:anchor="_Toc243436765" w:history="1">
         <w:r>
           <w:rPr>
             <w:rStyle w:val="Hyperlink"/>
@@ -1781,7 +1781,7 @@
           <w:rPr>
             <w:webHidden/>
           </w:rPr>
-          <w:instrText xml:space="preserve"> PAGEREF _Toc242917910 \h </w:instrText>
+          <w:instrText xml:space="preserve"> PAGEREF _Toc243436765 \h </w:instrText>
         </w:r>
         <w:r>
           <w:rPr>
@@ -1816,7 +1816,7 @@
           <w:lang w:eastAsia="pt-BR"/>
         </w:rPr>
       </w:pPr>
-      <w:hyperlink w:anchor="_Toc242917911" w:history="1">
+      <w:hyperlink w:anchor="_Toc243436766" w:history="1">
         <w:r>
           <w:rPr>
             <w:rStyle w:val="Hyperlink"/>
@@ -1839,7 +1839,7 @@
           <w:rPr>
             <w:webHidden/>
           </w:rPr>
-          <w:instrText xml:space="preserve"> PAGEREF _Toc242917911 \h </w:instrText>
+          <w:instrText xml:space="preserve"> PAGEREF _Toc243436766 \h </w:instrText>
         </w:r>
         <w:r>
           <w:rPr>
@@ -1874,7 +1874,7 @@
           <w:lang w:eastAsia="pt-BR"/>
         </w:rPr>
       </w:pPr>
-      <w:hyperlink w:anchor="_Toc242917912" w:history="1">
+      <w:hyperlink w:anchor="_Toc243436767" w:history="1">
         <w:r>
           <w:rPr>
             <w:rStyle w:val="Hyperlink"/>
@@ -1897,7 +1897,7 @@
           <w:rPr>
             <w:webHidden/>
           </w:rPr>
-          <w:instrText xml:space="preserve"> PAGEREF _Toc242917912 \h </w:instrText>
+          <w:instrText xml:space="preserve"> PAGEREF _Toc243436767 \h </w:instrText>
         </w:r>
         <w:r>
           <w:rPr>
@@ -1932,7 +1932,7 @@
           <w:lang w:eastAsia="pt-BR"/>
         </w:rPr>
       </w:pPr>
-      <w:hyperlink w:anchor="_Toc242917913" w:history="1">
+      <w:hyperlink w:anchor="_Toc243436768" w:history="1">
         <w:r>
           <w:rPr>
             <w:rStyle w:val="Hyperlink"/>
@@ -1955,7 +1955,7 @@
           <w:rPr>
             <w:webHidden/>
           </w:rPr>
-          <w:instrText xml:space="preserve"> PAGEREF _Toc242917913 \h </w:instrText>
+          <w:instrText xml:space="preserve"> PAGEREF _Toc243436768 \h </w:instrText>
         </w:r>
         <w:r>
           <w:rPr>
@@ -1990,7 +1990,7 @@
           <w:lang w:eastAsia="pt-BR"/>
         </w:rPr>
       </w:pPr>
-      <w:hyperlink w:anchor="_Toc242917914" w:history="1">
+      <w:hyperlink w:anchor="_Toc243436769" w:history="1">
         <w:r>
           <w:rPr>
             <w:rStyle w:val="Hyperlink"/>
@@ -2013,7 +2013,7 @@
           <w:rPr>
             <w:webHidden/>
           </w:rPr>
-          <w:instrText xml:space="preserve"> PAGEREF _Toc242917914 \h </w:instrText>
+          <w:instrText xml:space="preserve"> PAGEREF _Toc243436769 \h </w:instrText>
         </w:r>
         <w:r>
           <w:rPr>
@@ -2048,7 +2048,7 @@
           <w:lang w:eastAsia="pt-BR"/>
         </w:rPr>
       </w:pPr>
-      <w:hyperlink w:anchor="_Toc242917915" w:history="1">
+      <w:hyperlink w:anchor="_Toc243436770" w:history="1">
         <w:r>
           <w:rPr>
             <w:rStyle w:val="Hyperlink"/>
@@ -2071,7 +2071,7 @@
           <w:rPr>
             <w:webHidden/>
           </w:rPr>
-          <w:instrText xml:space="preserve"> PAGEREF _Toc242917915 \h </w:instrText>
+          <w:instrText xml:space="preserve"> PAGEREF _Toc243436770 \h </w:instrText>
         </w:r>
         <w:r>
           <w:rPr>
@@ -2106,7 +2106,7 @@
           <w:lang w:eastAsia="pt-BR"/>
         </w:rPr>
       </w:pPr>
-      <w:hyperlink w:anchor="_Toc242917916" w:history="1">
+      <w:hyperlink w:anchor="_Toc243436771" w:history="1">
         <w:r>
           <w:rPr>
             <w:rStyle w:val="Hyperlink"/>
@@ -2129,7 +2129,7 @@
           <w:rPr>
             <w:webHidden/>
           </w:rPr>
-          <w:instrText xml:space="preserve"> PAGEREF _Toc242917916 \h </w:instrText>
+          <w:instrText xml:space="preserve"> PAGEREF _Toc243436771 \h </w:instrText>
         </w:r>
         <w:r>
           <w:rPr>
@@ -2164,7 +2164,7 @@
           <w:lang w:eastAsia="pt-BR"/>
         </w:rPr>
       </w:pPr>
-      <w:hyperlink w:anchor="_Toc242917917" w:history="1">
+      <w:hyperlink w:anchor="_Toc243436772" w:history="1">
         <w:r>
           <w:rPr>
             <w:rStyle w:val="Hyperlink"/>
@@ -2187,7 +2187,7 @@
           <w:rPr>
             <w:webHidden/>
           </w:rPr>
-          <w:instrText xml:space="preserve"> PAGEREF _Toc242917917 \h </w:instrText>
+          <w:instrText xml:space="preserve"> PAGEREF _Toc243436772 \h </w:instrText>
         </w:r>
         <w:r>
           <w:rPr>
@@ -2224,7 +2224,7 @@
           <w:lang w:eastAsia="pt-BR"/>
         </w:rPr>
       </w:pPr>
-      <w:hyperlink w:anchor="_Toc242917918" w:history="1">
+      <w:hyperlink w:anchor="_Toc243436773" w:history="1">
         <w:r>
           <w:rPr>
             <w:rStyle w:val="Hyperlink"/>
@@ -2247,7 +2247,7 @@
           <w:rPr>
             <w:webHidden/>
           </w:rPr>
-          <w:instrText xml:space="preserve"> PAGEREF _Toc242917918 \h </w:instrText>
+          <w:instrText xml:space="preserve"> PAGEREF _Toc243436773 \h </w:instrText>
         </w:r>
         <w:r>
           <w:rPr>
@@ -2284,7 +2284,7 @@
           <w:lang w:eastAsia="pt-BR"/>
         </w:rPr>
       </w:pPr>
-      <w:hyperlink w:anchor="_Toc242917919" w:history="1">
+      <w:hyperlink w:anchor="_Toc243436774" w:history="1">
         <w:r>
           <w:rPr>
             <w:rStyle w:val="Hyperlink"/>
@@ -2307,7 +2307,7 @@
           <w:rPr>
             <w:webHidden/>
           </w:rPr>
-          <w:instrText xml:space="preserve"> PAGEREF _Toc242917919 \h </w:instrText>
+          <w:instrText xml:space="preserve"> PAGEREF _Toc243436774 \h </w:instrText>
         </w:r>
         <w:r>
           <w:rPr>
@@ -2344,7 +2344,7 @@
           <w:lang w:eastAsia="pt-BR"/>
         </w:rPr>
       </w:pPr>
-      <w:hyperlink w:anchor="_Toc242917920" w:history="1">
+      <w:hyperlink w:anchor="_Toc243436775" w:history="1">
         <w:r>
           <w:rPr>
             <w:rStyle w:val="Hyperlink"/>
@@ -2367,7 +2367,7 @@
           <w:rPr>
             <w:webHidden/>
           </w:rPr>
-          <w:instrText xml:space="preserve"> PAGEREF _Toc242917920 \h </w:instrText>
+          <w:instrText xml:space="preserve"> PAGEREF _Toc243436775 \h </w:instrText>
         </w:r>
         <w:r>
           <w:rPr>
@@ -2402,7 +2402,7 @@
           <w:lang w:eastAsia="pt-BR"/>
         </w:rPr>
       </w:pPr>
-      <w:hyperlink w:anchor="_Toc242917921" w:history="1">
+      <w:hyperlink w:anchor="_Toc243436776" w:history="1">
         <w:r>
           <w:rPr>
             <w:rStyle w:val="Hyperlink"/>
@@ -2425,7 +2425,7 @@
           <w:rPr>
             <w:webHidden/>
           </w:rPr>
-          <w:instrText xml:space="preserve"> PAGEREF _Toc242917921 \h </w:instrText>
+          <w:instrText xml:space="preserve"> PAGEREF _Toc243436776 \h </w:instrText>
         </w:r>
         <w:r>
           <w:rPr>
@@ -2460,7 +2460,7 @@
           <w:lang w:eastAsia="pt-BR"/>
         </w:rPr>
       </w:pPr>
-      <w:hyperlink w:anchor="_Toc242917922" w:history="1">
+      <w:hyperlink w:anchor="_Toc243436777" w:history="1">
         <w:r>
           <w:rPr>
             <w:rStyle w:val="Hyperlink"/>
@@ -2483,7 +2483,7 @@
           <w:rPr>
             <w:webHidden/>
           </w:rPr>
-          <w:instrText xml:space="preserve"> PAGEREF _Toc242917922 \h </w:instrText>
+          <w:instrText xml:space="preserve"> PAGEREF _Toc243436777 \h </w:instrText>
         </w:r>
         <w:r>
           <w:rPr>
@@ -2518,7 +2518,7 @@
           <w:lang w:eastAsia="pt-BR"/>
         </w:rPr>
       </w:pPr>
-      <w:hyperlink w:anchor="_Toc242917923" w:history="1">
+      <w:hyperlink w:anchor="_Toc243436778" w:history="1">
         <w:r>
           <w:rPr>
             <w:rStyle w:val="Hyperlink"/>
@@ -2541,7 +2541,7 @@
           <w:rPr>
             <w:webHidden/>
           </w:rPr>
-          <w:instrText xml:space="preserve"> PAGEREF _Toc242917923 \h </w:instrText>
+          <w:instrText xml:space="preserve"> PAGEREF _Toc243436778 \h </w:instrText>
         </w:r>
         <w:r>
           <w:rPr>
@@ -2576,7 +2576,7 @@
           <w:lang w:eastAsia="pt-BR"/>
         </w:rPr>
       </w:pPr>
-      <w:hyperlink w:anchor="_Toc242917924" w:history="1">
+      <w:hyperlink w:anchor="_Toc243436779" w:history="1">
         <w:r>
           <w:rPr>
             <w:rStyle w:val="Hyperlink"/>
@@ -2599,7 +2599,7 @@
           <w:rPr>
             <w:webHidden/>
           </w:rPr>
-          <w:instrText xml:space="preserve"> PAGEREF _Toc242917924 \h </w:instrText>
+          <w:instrText xml:space="preserve"> PAGEREF _Toc243436779 \h </w:instrText>
         </w:r>
         <w:r>
           <w:rPr>
@@ -2636,7 +2636,7 @@
           <w:lang w:eastAsia="pt-BR"/>
         </w:rPr>
       </w:pPr>
-      <w:hyperlink w:anchor="_Toc242917925" w:history="1">
+      <w:hyperlink w:anchor="_Toc243436780" w:history="1">
         <w:r>
           <w:rPr>
             <w:rStyle w:val="Hyperlink"/>
@@ -2659,7 +2659,7 @@
           <w:rPr>
             <w:webHidden/>
           </w:rPr>
-          <w:instrText xml:space="preserve"> PAGEREF _Toc242917925 \h </w:instrText>
+          <w:instrText xml:space="preserve"> PAGEREF _Toc243436780 \h </w:instrText>
         </w:r>
         <w:r>
           <w:rPr>
@@ -2694,7 +2694,7 @@
           <w:lang w:eastAsia="pt-BR"/>
         </w:rPr>
       </w:pPr>
-      <w:hyperlink w:anchor="_Toc242917926" w:history="1">
+      <w:hyperlink w:anchor="_Toc243436781" w:history="1">
         <w:r>
           <w:rPr>
             <w:rStyle w:val="Hyperlink"/>
@@ -2717,7 +2717,7 @@
           <w:rPr>
             <w:webHidden/>
           </w:rPr>
-          <w:instrText xml:space="preserve"> PAGEREF _Toc242917926 \h </w:instrText>
+          <w:instrText xml:space="preserve"> PAGEREF _Toc243436781 \h </w:instrText>
         </w:r>
         <w:r>
           <w:rPr>
@@ -2752,7 +2752,7 @@
           <w:lang w:eastAsia="pt-BR"/>
         </w:rPr>
       </w:pPr>
-      <w:hyperlink w:anchor="_Toc242917927" w:history="1">
+      <w:hyperlink w:anchor="_Toc243436782" w:history="1">
         <w:r>
           <w:rPr>
             <w:rStyle w:val="Hyperlink"/>
@@ -2775,7 +2775,7 @@
           <w:rPr>
             <w:webHidden/>
           </w:rPr>
-          <w:instrText xml:space="preserve"> PAGEREF _Toc242917927 \h </w:instrText>
+          <w:instrText xml:space="preserve"> PAGEREF _Toc243436782 \h </w:instrText>
         </w:r>
         <w:r>
           <w:rPr>
@@ -2824,7 +2824,7 @@
       <w:pPr>
         <w:pStyle w:val="Ttulo1"/>
       </w:pPr>
-      <w:bookmarkStart w:id="0" w:name="_Toc242917884"/>
+      <w:bookmarkStart w:id="0" w:name="_Toc243436739"/>
       <w:r>
         <w:lastRenderedPageBreak/>
         <w:t>INTRODUÇÃO</w:t>
@@ -2861,7 +2861,7 @@
       <w:pPr>
         <w:pStyle w:val="Ttulo2"/>
       </w:pPr>
-      <w:bookmarkStart w:id="1" w:name="_Toc242917885"/>
+      <w:bookmarkStart w:id="1" w:name="_Toc243436740"/>
       <w:r>
         <w:t>Visão Geral do Sistema</w:t>
       </w:r>
@@ -2914,7 +2914,7 @@
       <w:pPr>
         <w:pStyle w:val="Ttulo2"/>
       </w:pPr>
-      <w:bookmarkStart w:id="2" w:name="_Toc242917886"/>
+      <w:bookmarkStart w:id="2" w:name="_Toc243436741"/>
       <w:r>
         <w:t>Contexto do Projeto</w:t>
       </w:r>
@@ -2942,7 +2942,7 @@
       <w:pPr>
         <w:pStyle w:val="Ttulo2"/>
       </w:pPr>
-      <w:bookmarkStart w:id="3" w:name="_Toc242917887"/>
+      <w:bookmarkStart w:id="3" w:name="_Toc243436742"/>
       <w:r>
         <w:lastRenderedPageBreak/>
         <w:t>Convenções Adotadas</w:t>
@@ -3469,7 +3469,7 @@
       <w:pPr>
         <w:pStyle w:val="Ttulo2"/>
       </w:pPr>
-      <w:bookmarkStart w:id="4" w:name="_Toc242917888"/>
+      <w:bookmarkStart w:id="4" w:name="_Toc243436743"/>
       <w:r>
         <w:t>Documentos Relacionados</w:t>
       </w:r>
@@ -3512,7 +3512,7 @@
       <w:pPr>
         <w:pStyle w:val="Ttulo1"/>
       </w:pPr>
-      <w:bookmarkStart w:id="5" w:name="_Toc242917889"/>
+      <w:bookmarkStart w:id="5" w:name="_Toc243436744"/>
       <w:r>
         <w:lastRenderedPageBreak/>
         <w:t>OBJETIVOS DO PROJETO</w:t>
@@ -3523,7 +3523,7 @@
       <w:pPr>
         <w:pStyle w:val="Ttulo2"/>
       </w:pPr>
-      <w:bookmarkStart w:id="6" w:name="_Toc242917890"/>
+      <w:bookmarkStart w:id="6" w:name="_Toc243436745"/>
       <w:r>
         <w:t>Objetivo Geral</w:t>
       </w:r>
@@ -3551,7 +3551,7 @@
       <w:pPr>
         <w:pStyle w:val="Ttulo2"/>
       </w:pPr>
-      <w:bookmarkStart w:id="7" w:name="_Toc242917891"/>
+      <w:bookmarkStart w:id="7" w:name="_Toc243436746"/>
       <w:r>
         <w:t>Objetivos Específicos</w:t>
       </w:r>
@@ -3690,7 +3690,7 @@
       <w:pPr>
         <w:pStyle w:val="Ttulo1"/>
       </w:pPr>
-      <w:bookmarkStart w:id="8" w:name="_Toc242917892"/>
+      <w:bookmarkStart w:id="8" w:name="_Toc243436747"/>
       <w:r>
         <w:lastRenderedPageBreak/>
         <w:t>DECLARAÇÃO DE ESCOPO</w:t>
@@ -3701,7 +3701,7 @@
       <w:pPr>
         <w:pStyle w:val="Ttulo2"/>
       </w:pPr>
-      <w:bookmarkStart w:id="9" w:name="_Toc242917893"/>
+      <w:bookmarkStart w:id="9" w:name="_Toc243436748"/>
       <w:r>
         <w:t>Descrição do Produto</w:t>
       </w:r>
@@ -3729,7 +3729,7 @@
       <w:pPr>
         <w:pStyle w:val="Ttulo2"/>
       </w:pPr>
-      <w:bookmarkStart w:id="10" w:name="_Toc242917894"/>
+      <w:bookmarkStart w:id="10" w:name="_Toc243436749"/>
       <w:r>
         <w:t>Escopo do Produto</w:t>
       </w:r>
@@ -4612,7 +4612,7 @@
       <w:pPr>
         <w:pStyle w:val="Ttulo2"/>
       </w:pPr>
-      <w:bookmarkStart w:id="11" w:name="_Toc242917895"/>
+      <w:bookmarkStart w:id="11" w:name="_Toc243436750"/>
       <w:r>
         <w:t>Fora do Escopo</w:t>
       </w:r>
@@ -4727,7 +4727,7 @@
       <w:pPr>
         <w:pStyle w:val="Ttulo2"/>
       </w:pPr>
-      <w:bookmarkStart w:id="12" w:name="_Toc242917896"/>
+      <w:bookmarkStart w:id="12" w:name="_Toc243436751"/>
       <w:r>
         <w:lastRenderedPageBreak/>
         <w:t>Premissas</w:t>
@@ -4795,7 +4795,7 @@
       <w:pPr>
         <w:pStyle w:val="Ttulo2"/>
       </w:pPr>
-      <w:bookmarkStart w:id="13" w:name="_Toc242917897"/>
+      <w:bookmarkStart w:id="13" w:name="_Toc243436752"/>
       <w:r>
         <w:t>Restrições</w:t>
       </w:r>
@@ -4874,7 +4874,7 @@
       <w:pPr>
         <w:pStyle w:val="Ttulo2"/>
       </w:pPr>
-      <w:bookmarkStart w:id="14" w:name="_Toc242917898"/>
+      <w:bookmarkStart w:id="14" w:name="_Toc243436753"/>
       <w:r>
         <w:t>Entregas</w:t>
       </w:r>
@@ -4951,7 +4951,7 @@
       <w:pPr>
         <w:pStyle w:val="Ttulo1"/>
       </w:pPr>
-      <w:bookmarkStart w:id="15" w:name="_Toc242917899"/>
+      <w:bookmarkStart w:id="15" w:name="_Toc243436754"/>
       <w:r>
         <w:lastRenderedPageBreak/>
         <w:t>GLOSSÁRIO E ABREVIAÇÕES</w:t>
@@ -4962,7 +4962,7 @@
       <w:pPr>
         <w:pStyle w:val="Ttulo2"/>
       </w:pPr>
-      <w:bookmarkStart w:id="16" w:name="_Toc242917900"/>
+      <w:bookmarkStart w:id="16" w:name="_Toc243436755"/>
       <w:r>
         <w:t>Glossário</w:t>
       </w:r>
@@ -5931,7 +5931,7 @@
       <w:pPr>
         <w:pStyle w:val="Ttulo2"/>
       </w:pPr>
-      <w:bookmarkStart w:id="17" w:name="_Toc242917901"/>
+      <w:bookmarkStart w:id="17" w:name="_Toc243436756"/>
       <w:r>
         <w:t>Abreviações e Siglas</w:t>
       </w:r>
@@ -6689,7 +6689,7 @@
       <w:pPr>
         <w:pStyle w:val="Ttulo1"/>
       </w:pPr>
-      <w:bookmarkStart w:id="18" w:name="_Toc242917902"/>
+      <w:bookmarkStart w:id="18" w:name="_Toc243436757"/>
       <w:r>
         <w:lastRenderedPageBreak/>
         <w:t>ATORES DO SISTEMA</w:t>
@@ -7041,8 +7041,9 @@
       <w:pPr>
         <w:pStyle w:val="Ttulo1"/>
       </w:pPr>
-      <w:bookmarkStart w:id="19" w:name="_Toc242917903"/>
+      <w:bookmarkStart w:id="19" w:name="_Toc243436758"/>
       <w:r>
+        <w:lastRenderedPageBreak/>
         <w:t>REQUISITOS FUNCIONAIS</w:t>
       </w:r>
       <w:bookmarkEnd w:id="19"/>
@@ -7059,7 +7060,7 @@
       <w:pPr>
         <w:pStyle w:val="Ttulo2"/>
       </w:pPr>
-      <w:bookmarkStart w:id="20" w:name="_Toc242917904"/>
+      <w:bookmarkStart w:id="20" w:name="_Toc243436759"/>
       <w:r>
         <w:t>Portal Público e do Cliente</w:t>
       </w:r>
@@ -7077,7 +7078,7 @@
       <w:pPr>
         <w:pStyle w:val="Ttulo3"/>
       </w:pPr>
-      <w:bookmarkStart w:id="21" w:name="_Toc242917905"/>
+      <w:bookmarkStart w:id="21" w:name="_Toc243436760"/>
       <w:r>
         <w:t>Página Inicial e Catálogo</w:t>
       </w:r>
@@ -7530,7 +7531,7 @@
       <w:pPr>
         <w:pStyle w:val="Ttulo3"/>
       </w:pPr>
-      <w:bookmarkStart w:id="28" w:name="_Toc242917906"/>
+      <w:bookmarkStart w:id="28" w:name="_Toc243436761"/>
       <w:r>
         <w:t>Cadastro e Autenticação de Clientes</w:t>
       </w:r>
@@ -7760,6 +7761,7 @@
             </w:pPr>
             <w:bookmarkStart w:id="31" w:name="RF009"/>
             <w:r>
+              <w:lastRenderedPageBreak/>
               <w:t>RF009</w:t>
             </w:r>
             <w:bookmarkEnd w:id="31"/>
@@ -7937,7 +7939,7 @@
       <w:pPr>
         <w:pStyle w:val="Ttulo3"/>
       </w:pPr>
-      <w:bookmarkStart w:id="34" w:name="_Toc242917907"/>
+      <w:bookmarkStart w:id="34" w:name="_Toc243436762"/>
       <w:r>
         <w:t>Área do Cliente</w:t>
       </w:r>
@@ -8441,7 +8443,7 @@
       <w:pPr>
         <w:pStyle w:val="Ttulo3"/>
       </w:pPr>
-      <w:bookmarkStart w:id="42" w:name="_Toc242917908"/>
+      <w:bookmarkStart w:id="42" w:name="_Toc243436763"/>
       <w:r>
         <w:t>Agendamento de Serviços</w:t>
       </w:r>
@@ -8800,6 +8802,7 @@
             </w:pPr>
             <w:bookmarkStart w:id="47" w:name="RF023"/>
             <w:r>
+              <w:lastRenderedPageBreak/>
               <w:t>RF023</w:t>
             </w:r>
             <w:bookmarkEnd w:id="47"/>
@@ -9096,7 +9099,7 @@
       <w:pPr>
         <w:pStyle w:val="Ttulo3"/>
       </w:pPr>
-      <w:bookmarkStart w:id="52" w:name="_Toc242917909"/>
+      <w:bookmarkStart w:id="52" w:name="_Toc243436764"/>
       <w:r>
         <w:t>Acompanhamento de Agendamentos</w:t>
       </w:r>
@@ -9504,7 +9507,7 @@
       <w:pPr>
         <w:pStyle w:val="Ttulo2"/>
       </w:pPr>
-      <w:bookmarkStart w:id="58" w:name="_Toc242917910"/>
+      <w:bookmarkStart w:id="58" w:name="_Toc243436765"/>
       <w:r>
         <w:t>Painel Administrativo</w:t>
       </w:r>
@@ -9522,8 +9525,9 @@
       <w:pPr>
         <w:pStyle w:val="Ttulo3"/>
       </w:pPr>
-      <w:bookmarkStart w:id="59" w:name="_Toc242917911"/>
+      <w:bookmarkStart w:id="59" w:name="_Toc243436766"/>
       <w:r>
+        <w:lastRenderedPageBreak/>
         <w:t>Autenticação e Controle de Acesso</w:t>
       </w:r>
       <w:bookmarkEnd w:id="59"/>
@@ -10069,7 +10073,7 @@
       <w:pPr>
         <w:pStyle w:val="Ttulo3"/>
       </w:pPr>
-      <w:bookmarkStart w:id="67" w:name="_Toc242917912"/>
+      <w:bookmarkStart w:id="67" w:name="_Toc243436767"/>
       <w:r>
         <w:t>Dashboard</w:t>
       </w:r>
@@ -10403,7 +10407,7 @@
       <w:pPr>
         <w:pStyle w:val="Ttulo3"/>
       </w:pPr>
-      <w:bookmarkStart w:id="72" w:name="_Toc242917913"/>
+      <w:bookmarkStart w:id="72" w:name="_Toc243436768"/>
       <w:r>
         <w:t>Gestão de Agendamentos</w:t>
       </w:r>
@@ -10681,6 +10685,7 @@
             </w:pPr>
             <w:bookmarkStart w:id="76" w:name="RF047"/>
             <w:r>
+              <w:lastRenderedPageBreak/>
               <w:t>RF047</w:t>
             </w:r>
             <w:bookmarkEnd w:id="76"/>
@@ -11250,7 +11255,7 @@
       <w:pPr>
         <w:pStyle w:val="Ttulo3"/>
       </w:pPr>
-      <w:bookmarkStart w:id="86" w:name="_Toc242917914"/>
+      <w:bookmarkStart w:id="86" w:name="_Toc243436769"/>
       <w:r>
         <w:t>Gestão de Serviços e Categorias</w:t>
       </w:r>
@@ -11587,6 +11592,7 @@
             </w:pPr>
             <w:bookmarkStart w:id="91" w:name="RF061"/>
             <w:r>
+              <w:lastRenderedPageBreak/>
               <w:t>RF061</w:t>
             </w:r>
             <w:bookmarkEnd w:id="91"/>
@@ -12049,7 +12055,7 @@
       <w:pPr>
         <w:pStyle w:val="Ttulo3"/>
       </w:pPr>
-      <w:bookmarkStart w:id="99" w:name="_Toc242917915"/>
+      <w:bookmarkStart w:id="99" w:name="_Toc243436770"/>
       <w:r>
         <w:t>Gestão de Clientes e Veículos</w:t>
       </w:r>
@@ -12623,8 +12629,9 @@
       <w:pPr>
         <w:pStyle w:val="Ttulo3"/>
       </w:pPr>
-      <w:bookmarkStart w:id="108" w:name="_Toc242917916"/>
+      <w:bookmarkStart w:id="108" w:name="_Toc243436771"/>
       <w:r>
+        <w:lastRenderedPageBreak/>
         <w:t>Gestão de Funcionários e Cargos</w:t>
       </w:r>
       <w:bookmarkEnd w:id="108"/>
@@ -13197,7 +13204,7 @@
       <w:pPr>
         <w:pStyle w:val="Ttulo3"/>
       </w:pPr>
-      <w:bookmarkStart w:id="117" w:name="_Toc242917917"/>
+      <w:bookmarkStart w:id="117" w:name="_Toc243436772"/>
       <w:r>
         <w:t>Configurações</w:t>
       </w:r>
@@ -13535,8 +13542,9 @@
       <w:pPr>
         <w:pStyle w:val="Ttulo1"/>
       </w:pPr>
-      <w:bookmarkStart w:id="122" w:name="_Toc242917918"/>
+      <w:bookmarkStart w:id="122" w:name="_Toc243436773"/>
       <w:r>
+        <w:lastRenderedPageBreak/>
         <w:t>REQUISITOS NÃO FUNCIONAIS</w:t>
       </w:r>
       <w:bookmarkEnd w:id="122"/>
@@ -14310,6 +14318,7 @@
             </w:pPr>
             <w:bookmarkStart w:id="133" w:name="RNF011"/>
             <w:r>
+              <w:lastRenderedPageBreak/>
               <w:t>RNF011</w:t>
             </w:r>
             <w:bookmarkEnd w:id="133"/>
@@ -14676,8 +14685,9 @@
       <w:pPr>
         <w:pStyle w:val="Ttulo1"/>
       </w:pPr>
-      <w:bookmarkStart w:id="139" w:name="_Toc242917919"/>
+      <w:bookmarkStart w:id="139" w:name="_Toc243436774"/>
       <w:r>
+        <w:lastRenderedPageBreak/>
         <w:t>REQUISITOS DE SEGURANÇA</w:t>
       </w:r>
       <w:bookmarkEnd w:id="139"/>
@@ -15490,6 +15500,7 @@
             </w:pPr>
             <w:bookmarkStart w:id="153" w:name="RS014"/>
             <w:r>
+              <w:lastRenderedPageBreak/>
               <w:t>RS014</w:t>
             </w:r>
             <w:bookmarkEnd w:id="153"/>
@@ -15755,8 +15766,9 @@
       <w:pPr>
         <w:pStyle w:val="Ttulo1"/>
       </w:pPr>
-      <w:bookmarkStart w:id="158" w:name="_Toc242917920"/>
+      <w:bookmarkStart w:id="158" w:name="_Toc243436775"/>
       <w:r>
+        <w:lastRenderedPageBreak/>
         <w:t>REGRAS DE NEGÓCIO</w:t>
       </w:r>
       <w:bookmarkEnd w:id="158"/>
@@ -15773,7 +15785,7 @@
       <w:pPr>
         <w:pStyle w:val="Ttulo2"/>
       </w:pPr>
-      <w:bookmarkStart w:id="159" w:name="_Toc242917921"/>
+      <w:bookmarkStart w:id="159" w:name="_Toc243436776"/>
       <w:r>
         <w:t>Relação das Regras de Negócio</w:t>
       </w:r>
@@ -16418,6 +16430,7 @@
             </w:pPr>
             <w:bookmarkStart w:id="170" w:name="RN011"/>
             <w:r>
+              <w:lastRenderedPageBreak/>
               <w:t>RN011</w:t>
             </w:r>
             <w:bookmarkEnd w:id="170"/>
@@ -16993,6 +17006,7 @@
             </w:pPr>
             <w:bookmarkStart w:id="182" w:name="RN023"/>
             <w:r>
+              <w:lastRenderedPageBreak/>
               <w:t>RN023</w:t>
             </w:r>
             <w:bookmarkEnd w:id="182"/>
@@ -17515,6 +17529,7 @@
             </w:pPr>
             <w:bookmarkStart w:id="192" w:name="RN033"/>
             <w:r>
+              <w:lastRenderedPageBreak/>
               <w:t>RN033</w:t>
             </w:r>
             <w:bookmarkEnd w:id="192"/>
@@ -17553,7 +17568,19 @@
               </w:r>
             </w:hyperlink>
             <w:r>
-              <w:t>). Se alterados pelo cliente, só podem ser postergados, isto é, passar para uma data e um horário futuros e posteriores aos marcados. Se alterados pelo funcionário, podem ser adiantados ou postergados, sem ficar no passado enquanto o agendamento estiver “Agendado” e sem ser posteriores ao momento da alteração depois que o veículo chegou à empresa. Os valores são sempre calculados pelo sistema, sem informação manual: a troca do veículo ou dos serviços recalcula o valor de todos os serviços pelo catálogo atual, a troca da forma de pagamento aplica o percentual vigente, e o subtotal, o total, a duração estimada e a previsão de conclusão são recalculados (</w:t>
+              <w:t>).</w:t>
+            </w:r>
+            <w:r>
+              <w:t xml:space="preserve"> A data e o horário só são conferidos quando alterados: a edição que mantém a data e o horário marcados não os confere de novo, mesmo que já tenham passado ou que a disponibilidade tenha mudado.</w:t>
+            </w:r>
+            <w:r>
+              <w:t xml:space="preserve"> Se alterados pelo cliente, só podem ser postergados, isto é, passar para uma data e um horário futuros e posteriores aos marcados. Se alterados pelo funcionário, podem ser adiantados ou postergados, sem ficar no passado enquanto o agendamento estiver “Agendado” e sem ser posteriores ao momento da alteração depois que o veículo </w:t>
+            </w:r>
+            <w:r>
+              <w:t>chegou à empresa (“Em espera”, “Em execução”, “Finalizado”, “Concluído” e “Reagendado”). No agendamento “Cancelado”, vale só a disponibilidade.</w:t>
+            </w:r>
+            <w:r>
+              <w:t xml:space="preserve"> Os valores são sempre calculados pelo sistema, sem informação manual: a troca do veículo ou dos serviços recalcula o valor de todos os serviços pelo catálogo atual, a troca da forma de pagamento aplica o percentual vigente, e o subtotal, o total, a duração estimada e a previsão de conclusão são recalculados (</w:t>
             </w:r>
             <w:hyperlink w:anchor="RN034" w:history="1">
               <w:r>
@@ -17795,8 +17822,9 @@
       <w:pPr>
         <w:pStyle w:val="Ttulo2"/>
       </w:pPr>
-      <w:bookmarkStart w:id="197" w:name="_Toc242917922"/>
+      <w:bookmarkStart w:id="197" w:name="_Toc243436777"/>
       <w:r>
+        <w:lastRenderedPageBreak/>
         <w:t>Porte do Veículo</w:t>
       </w:r>
       <w:bookmarkEnd w:id="197"/>
@@ -18049,7 +18077,7 @@
       <w:pPr>
         <w:pStyle w:val="Ttulo2"/>
       </w:pPr>
-      <w:bookmarkStart w:id="198" w:name="_Toc242917923"/>
+      <w:bookmarkStart w:id="198" w:name="_Toc243436778"/>
       <w:r>
         <w:t>Ciclo de Vida do Agendamento</w:t>
       </w:r>
@@ -18534,7 +18562,7 @@
       <w:pPr>
         <w:pStyle w:val="Ttulo2"/>
       </w:pPr>
-      <w:bookmarkStart w:id="199" w:name="_Toc242917924"/>
+      <w:bookmarkStart w:id="199" w:name="_Toc243436779"/>
       <w:r>
         <w:t>Formato dos Dados</w:t>
       </w:r>
@@ -18576,7 +18604,11 @@
         <w:keepNext/>
       </w:pPr>
       <w:r>
-        <w:t>Em todos os campos de texto, são removidos os espaços no início e no fim, os espaços repetidos e os caracteres de controle, e o conteúdo é tratado como texto puro, sem interpretação de HTML.</w:t>
+        <w:t xml:space="preserve">Em todos os campos de texto, exceto a senha, a tabulação e a quebra de linha viram espaço, os demais caracteres de controle são removidos, o acento digitado como sinal separado é unido à letra (forma NFC do Unicode), e os espaços no início, </w:t>
+      </w:r>
+      <w:r>
+        <w:lastRenderedPageBreak/>
+        <w:t>no fim e repetidos são removidos. O conteúdo é tratado como texto puro, sem interpretação de HTML, e as descrições ficam em um único parágrafo.</w:t>
       </w:r>
     </w:p>
     <w:p>
@@ -18720,6 +18752,9 @@
             <w:r>
               <w:t>De 2 a 60 caracteres cada, com letras, inclusive acentuadas, espaço, hífen e apóstrofo. Cada palavra é gravada com a inicial maiúscula e as demais letras minúsculas; as partículas “da”, “de”, “do”, “das”, “dos” e “e” ficam em minúsculas.</w:t>
             </w:r>
+            <w:r>
+              <w:t xml:space="preserve"> A inicial também fica maiúscula depois do hífen e do apóstrofo (Ana-Maria, D'Ávila). Hífen e apóstrofo só aparecem entre letras, e o apóstrofo tipográfico (’) é gravado como '.</w:t>
+            </w:r>
           </w:p>
         </w:tc>
         <w:tc>
@@ -18894,7 +18929,10 @@
               <w:pStyle w:val="TextodeTabela"/>
             </w:pPr>
             <w:r>
-              <w:t>De 8 a 72 caracteres, com ao menos uma letra maiúscula, um número e um caractere especial (</w:t>
+              <w:t xml:space="preserve">De 8 a 72 caracteres, com ao menos </w:t>
+            </w:r>
+            <w:r>
+              <w:t>uma letra maiúscula, inclusive acentuada, um número e um caractere especial, que é qualquer caractere que não seja letra, número ou espaço (</w:t>
             </w:r>
             <w:hyperlink w:anchor="RS003" w:history="1">
               <w:r>
@@ -18907,6 +18945,29 @@
             <w:r>
               <w:t>).</w:t>
             </w:r>
+            <w:r>
+              <w:t xml:space="preserve"> É gravada como digitada, sem a normalização dos textos. O limite de 72 conta bytes em UTF-8, o limite do bcrypt: cada letra acentuada conta como dois. No </w:t>
+            </w:r>
+            <w:r>
+              <w:rPr>
+                <w:i/>
+              </w:rPr>
+              <w:t>login</w:t>
+            </w:r>
+            <w:r>
+              <w:t>, a senha só é obrigatória e limitada a 72 bytes; as regras de composição valem onde a senha é definida, para a senha fora delas receber a mesma resposta da senha errada (</w:t>
+            </w:r>
+            <w:hyperlink w:anchor="RS005" w:history="1">
+              <w:r>
+                <w:rPr>
+                  <w:rStyle w:val="Hyperlink"/>
+                </w:rPr>
+                <w:t>RS005</w:t>
+              </w:r>
+            </w:hyperlink>
+            <w:r>
+              <w:t>).</w:t>
+            </w:r>
           </w:p>
         </w:tc>
         <w:tc>
@@ -18993,7 +19054,10 @@
               <w:pStyle w:val="TextodeTabela"/>
             </w:pPr>
             <w:r>
-              <w:t>De 1 a 40 caracteres. A inicial de cada palavra é gravada em maiúscula, preservando as siglas digitadas em maiúsculas.</w:t>
+              <w:t xml:space="preserve">De 1 a 40 caracteres. A inicial de cada palavra é gravada em maiúscula, </w:t>
+            </w:r>
+            <w:r>
+              <w:t>e as demais letras ficam como digitadas, o que preserva as siglas.</w:t>
             </w:r>
           </w:p>
         </w:tc>
@@ -19068,6 +19132,7 @@
               <w:pStyle w:val="TextodeTabela"/>
             </w:pPr>
             <w:r>
+              <w:lastRenderedPageBreak/>
               <w:t>Ano do veículo</w:t>
             </w:r>
           </w:p>
@@ -19081,7 +19146,10 @@
               <w:pStyle w:val="TextodeTabela"/>
             </w:pPr>
             <w:r>
-              <w:t>Número inteiro de 1886, ano do primeiro automóvel, até o ano corrente.</w:t>
+              <w:t xml:space="preserve">Número inteiro de 1886, ano do primeiro automóvel, </w:t>
+            </w:r>
+            <w:r>
+              <w:t>até o ano seguinte ao corrente, para aceitar o ano-modelo de um veículo novo. O ano corrente é o do fuso da empresa.</w:t>
             </w:r>
           </w:p>
         </w:tc>
@@ -19226,7 +19294,7 @@
               <w:pStyle w:val="TextodeTabela"/>
             </w:pPr>
             <w:r>
-              <w:t>1 h 30 min</w:t>
+              <w:t>1 h 30 min; 45 min; 2 h</w:t>
             </w:r>
           </w:p>
         </w:tc>
@@ -19312,7 +19380,7 @@
               <w:pStyle w:val="TextodeTabela"/>
             </w:pPr>
             <w:r>
-              <w:t>Catorze algarismos, com dígitos verificadores válidos. Gravado apenas com os algarismos.</w:t>
+              <w:t>Catorze caracteres: os doze primeiros algarismos ou letras, já que a Receita Federal emite CNPJ alfanumérico desde julho de 2026, e os dois últimos algarismos, com dígitos verificadores válidos. Não pode ter os catorze caracteres iguais. Gravado sem a máscara, com as letras em maiúsculas.</w:t>
             </w:r>
           </w:p>
         </w:tc>
@@ -19325,7 +19393,7 @@
               <w:pStyle w:val="TextodeTabela"/>
             </w:pPr>
             <w:r>
-              <w:t>12.345.678/0001-90</w:t>
+              <w:t>12.345.678/0001-95</w:t>
             </w:r>
           </w:p>
         </w:tc>
@@ -19356,7 +19424,7 @@
               <w:pStyle w:val="TextodeTabela"/>
             </w:pPr>
             <w:r>
-              <w:t>Endereço iniciado por https:// e pertencente ao domínio da respectiva rede social.</w:t>
+              <w:t>Endereço iniciado por https://, no domínio da respectiva rede social (instagram.com ou facebook.com) ou num subdomínio dele, como www.instagram.com e m.facebook.com, seguido do caminho do perfil, com até 200 caracteres.</w:t>
             </w:r>
           </w:p>
         </w:tc>
@@ -19400,7 +19468,13 @@
               <w:pStyle w:val="TextodeTabela"/>
             </w:pPr>
             <w:r>
-              <w:t>De 2 a 60 caracteres, gravados com a inicial maiúscula. O nome não pode se repetir entre os serviços não excluídos, entre as categorias nem entre os cargos.</w:t>
+              <w:t xml:space="preserve">De 2 a 60 caracteres, </w:t>
+            </w:r>
+            <w:r>
+              <w:t>gravados com a inicial maiúscula e as demais letras como digitadas.</w:t>
+            </w:r>
+            <w:r>
+              <w:t xml:space="preserve"> O nome não pode se repetir entre os serviços não excluídos, entre as categorias nem entre os cargos.</w:t>
             </w:r>
           </w:p>
         </w:tc>
@@ -19444,7 +19518,10 @@
               <w:pStyle w:val="TextodeTabela"/>
             </w:pPr>
             <w:r>
-              <w:t>De 2 a 60 caracteres, gravada com a inicial maiúscula.</w:t>
+              <w:t xml:space="preserve">De 2 a 60 caracteres, </w:t>
+            </w:r>
+            <w:r>
+              <w:t>gravada com a inicial maiúscula e as demais letras como digitadas.</w:t>
             </w:r>
           </w:p>
         </w:tc>
@@ -19653,7 +19730,20 @@
         <w:spacing w:before="240"/>
       </w:pPr>
       <w:r>
+        <w:lastRenderedPageBreak/>
+        <w:t>DDD válido é um dos 67 códigos nacionais da Anatel: 11 a 19, 21, 22, 24, 27, 28, 31 a 35, 37, 38, 41 a 49, 51, 53 a 55, 61 a 69, 71, 73 a 75, 77, 79, 81 a 89 e 91 a 99. Na digitação, são aceitos e removidos os parênteses, os espaços, os hífens e os pontos dos telefones, e os pontos, a barra e o hífen do CNPJ. O código do país (+55) não é aceito.</w:t>
+      </w:r>
+    </w:p>
+    <w:p>
+      <w:pPr>
+        <w:pStyle w:val="Texto"/>
+        <w:keepNext/>
+      </w:pPr>
+      <w:r>
         <w:t>O Quadro 24 relaciona, para cada cadastro, as informações obrigatórias e as opcionais. Um cadastro só é gravado quando todas as obrigatórias estão presentes e válidas.</w:t>
+      </w:r>
+      <w:r>
+        <w:t xml:space="preserve"> Uma opcional deixada vazia fica sem valor, e o valor que estava gravado é apagado.</w:t>
       </w:r>
     </w:p>
     <w:p>
@@ -20390,8 +20480,9 @@
       <w:pPr>
         <w:pStyle w:val="Ttulo1"/>
       </w:pPr>
-      <w:bookmarkStart w:id="200" w:name="_Toc242917925"/>
+      <w:bookmarkStart w:id="200" w:name="_Toc243436780"/>
       <w:r>
+        <w:lastRenderedPageBreak/>
         <w:t>CASOS DE USO</w:t>
       </w:r>
       <w:bookmarkEnd w:id="200"/>
@@ -20408,7 +20499,7 @@
       <w:pPr>
         <w:pStyle w:val="Ttulo2"/>
       </w:pPr>
-      <w:bookmarkStart w:id="201" w:name="_Toc242917926"/>
+      <w:bookmarkStart w:id="201" w:name="_Toc243436781"/>
       <w:r>
         <w:t>Visão Geral dos Casos de Uso</w:t>
       </w:r>
@@ -23086,7 +23177,7 @@
       <w:pPr>
         <w:pStyle w:val="Ttulo2"/>
       </w:pPr>
-      <w:bookmarkStart w:id="202" w:name="_Toc242917927"/>
+      <w:bookmarkStart w:id="202" w:name="_Toc243436782"/>
       <w:r>
         <w:t>Especificação dos Casos de Uso</w:t>
       </w:r>
@@ -23547,7 +23638,10 @@
             </w:r>
             <w:r>
               <w:tab/>
-              <w:t>O cliente autenticado acessa as páginas públicas da mesma forma, com a barra de navegação exibindo também as opções restritas ao cliente.</w:t>
+              <w:t xml:space="preserve">O cliente autenticado acessa as páginas públicas da mesma forma, com a barra de navegação </w:t>
+            </w:r>
+            <w:r>
+              <w:t>exibindo também as opções restritas ao cliente (Agendar, Meus agendamentos e Minha conta) e a opção de sair.</w:t>
             </w:r>
           </w:p>
         </w:tc>
@@ -23614,6 +23708,7 @@
                 <w:b/>
                 <w:bCs/>
               </w:rPr>
+              <w:lastRenderedPageBreak/>
               <w:t>FE02 – Falha ao carregar os dados (passos 2 ou 4)</w:t>
             </w:r>
           </w:p>
@@ -23641,6 +23736,7 @@
         <w:pStyle w:val="Legenda"/>
       </w:pPr>
       <w:r>
+        <w:lastRenderedPageBreak/>
         <w:t xml:space="preserve">Quadro </w:t>
       </w:r>
       <w:fldSimple w:instr=" SEQ Quadro \* ARABIC ">
@@ -24636,11 +24732,15 @@
               <w:ind w:left="397" w:hanging="397"/>
             </w:pPr>
             <w:r>
+              <w:lastRenderedPageBreak/>
               <w:t>5.</w:t>
             </w:r>
             <w:r>
               <w:tab/>
-              <w:t>O sistema inicia a sessão, identifica o perfil da conta e exibe a área restrita ao cliente (</w:t>
+              <w:t xml:space="preserve">O sistema inicia a sessão, identifica o perfil da conta e </w:t>
+            </w:r>
+            <w:r>
+              <w:t>exibe a página inicial do portal, com as opções restritas ao cliente (</w:t>
             </w:r>
             <w:hyperlink w:anchor="RS007" w:history="1">
               <w:r>
@@ -24682,6 +24782,7 @@
                 <w:b/>
                 <w:bCs/>
               </w:rPr>
+              <w:lastRenderedPageBreak/>
               <w:t>Fluxos alternativos</w:t>
             </w:r>
           </w:p>
@@ -24886,7 +24987,9 @@
             </w:r>
             <w:r>
               <w:tab/>
-              <w:t>O cliente informa a nova senha e confirma.</w:t>
+            </w:r>
+            <w:r>
+              <w:t>O cliente informa a senha inicial e a nova senha e confirma.</w:t>
             </w:r>
           </w:p>
           <w:p>
@@ -25539,6 +25642,7 @@
               <w:ind w:left="397" w:hanging="397"/>
             </w:pPr>
             <w:r>
+              <w:lastRenderedPageBreak/>
               <w:t>4.</w:t>
             </w:r>
             <w:r>
@@ -25582,6 +25686,7 @@
                 <w:b/>
                 <w:bCs/>
               </w:rPr>
+              <w:lastRenderedPageBreak/>
               <w:t>Fluxos alternativos</w:t>
             </w:r>
           </w:p>
@@ -26404,6 +26509,7 @@
                 <w:b/>
                 <w:bCs/>
               </w:rPr>
+              <w:lastRenderedPageBreak/>
               <w:t>Fluxos de exceção</w:t>
             </w:r>
           </w:p>
@@ -27200,6 +27306,7 @@
                 <w:b/>
                 <w:bCs/>
               </w:rPr>
+              <w:lastRenderedPageBreak/>
               <w:t>Fluxos alternativos</w:t>
             </w:r>
           </w:p>
@@ -28040,6 +28147,7 @@
                 <w:b/>
                 <w:bCs/>
               </w:rPr>
+              <w:lastRenderedPageBreak/>
               <w:t>FA03 – Edição de agendamento (passo 2)</w:t>
             </w:r>
           </w:p>
@@ -28087,6 +28195,7 @@
                 <w:b/>
                 <w:bCs/>
               </w:rPr>
+              <w:lastRenderedPageBreak/>
               <w:t>Fluxos de exceção</w:t>
             </w:r>
           </w:p>
@@ -28682,7 +28791,9 @@
             </w:r>
             <w:r>
               <w:tab/>
-              <w:t>O funcionário informa a nova senha e confirma.</w:t>
+            </w:r>
+            <w:r>
+              <w:t>O funcionário informa a senha inicial e a nova senha e confirma.</w:t>
             </w:r>
           </w:p>
           <w:p>
@@ -28949,7 +29060,10 @@
             </w:r>
             <w:r>
               <w:tab/>
-              <w:t>O funcionário tenta acessar uma página não permitida pelo seu cargo; o sistema nega o acesso e informa a restrição (</w:t>
+              <w:t xml:space="preserve">O funcionário tenta acessar uma página não permitida pelo seu cargo; o sistema </w:t>
+            </w:r>
+            <w:r>
+              <w:t>nega o acesso, exibe a primeira página permitida e informa a restrição (</w:t>
             </w:r>
             <w:hyperlink w:anchor="RS008" w:history="1">
               <w:r>
@@ -28960,6 +29074,17 @@
               </w:r>
             </w:hyperlink>
             <w:r>
+              <w:t xml:space="preserve">, </w:t>
+            </w:r>
+            <w:hyperlink w:anchor="RN025" w:history="1">
+              <w:r>
+                <w:rPr>
+                  <w:rStyle w:val="Hyperlink"/>
+                </w:rPr>
+                <w:t>RN025</w:t>
+              </w:r>
+            </w:hyperlink>
+            <w:r>
               <w:t>).</w:t>
             </w:r>
           </w:p>
@@ -28973,6 +29098,7 @@
                 <w:b/>
                 <w:bCs/>
               </w:rPr>
+              <w:lastRenderedPageBreak/>
               <w:t>FE04 – Nova senha inválida (FA01)</w:t>
             </w:r>
           </w:p>
@@ -29000,6 +29126,7 @@
         <w:pStyle w:val="Legenda"/>
       </w:pPr>
       <w:r>
+        <w:lastRenderedPageBreak/>
         <w:t xml:space="preserve">Quadro </w:t>
       </w:r>
       <w:fldSimple w:instr=" SEQ Quadro \* ARABIC ">
@@ -29939,6 +30066,7 @@
                 <w:b/>
                 <w:bCs/>
               </w:rPr>
+              <w:lastRenderedPageBreak/>
               <w:t>Fluxos alternativos</w:t>
             </w:r>
           </w:p>
@@ -30724,6 +30852,7 @@
               <w:ind w:left="397" w:hanging="397"/>
             </w:pPr>
             <w:r>
+              <w:lastRenderedPageBreak/>
               <w:t>8.</w:t>
             </w:r>
             <w:r>
@@ -30748,6 +30877,7 @@
                 <w:b/>
                 <w:bCs/>
               </w:rPr>
+              <w:lastRenderedPageBreak/>
               <w:t>Fluxos alternativos</w:t>
             </w:r>
           </w:p>
@@ -31562,6 +31692,7 @@
                 <w:b/>
                 <w:bCs/>
               </w:rPr>
+              <w:lastRenderedPageBreak/>
               <w:t>FA02 – Cancelamento do agendamento (passo 2)</w:t>
             </w:r>
           </w:p>
@@ -31644,6 +31775,7 @@
                 <w:b/>
                 <w:bCs/>
               </w:rPr>
+              <w:lastRenderedPageBreak/>
               <w:t>Fluxos de exceção</w:t>
             </w:r>
           </w:p>
@@ -32331,6 +32463,7 @@
               <w:ind w:left="397" w:hanging="397"/>
             </w:pPr>
             <w:r>
+              <w:lastRenderedPageBreak/>
               <w:t>3.</w:t>
             </w:r>
             <w:r>
@@ -32355,6 +32488,7 @@
                 <w:b/>
                 <w:bCs/>
               </w:rPr>
+              <w:lastRenderedPageBreak/>
               <w:t>Fluxos de exceção</w:t>
             </w:r>
           </w:p>
@@ -33138,6 +33272,7 @@
                 <w:b/>
                 <w:bCs/>
               </w:rPr>
+              <w:lastRenderedPageBreak/>
               <w:t>Fluxos de exceção</w:t>
             </w:r>
           </w:p>
@@ -33863,6 +33998,7 @@
         <w:pStyle w:val="Legenda"/>
       </w:pPr>
       <w:r>
+        <w:lastRenderedPageBreak/>
         <w:t xml:space="preserve">Quadro </w:t>
       </w:r>
       <w:fldSimple w:instr=" SEQ Quadro \* ARABIC ">
@@ -34882,6 +35018,7 @@
               <w:ind w:left="397" w:hanging="397"/>
             </w:pPr>
             <w:r>
+              <w:lastRenderedPageBreak/>
               <w:t>2.</w:t>
             </w:r>
             <w:r>
@@ -34957,6 +35094,7 @@
                 <w:b/>
                 <w:bCs/>
               </w:rPr>
+              <w:lastRenderedPageBreak/>
               <w:t>Fluxos de exceção</w:t>
             </w:r>
           </w:p>
@@ -35661,6 +35799,7 @@
               <w:ind w:left="397" w:hanging="397"/>
             </w:pPr>
             <w:r>
+              <w:lastRenderedPageBreak/>
               <w:t>4.</w:t>
             </w:r>
             <w:r>
@@ -35707,6 +35846,7 @@
                 <w:b/>
                 <w:bCs/>
               </w:rPr>
+              <w:lastRenderedPageBreak/>
               <w:t>Fluxos de exceção</w:t>
             </w:r>
           </w:p>
@@ -36426,6 +36566,7 @@
         <w:pStyle w:val="Legenda"/>
       </w:pPr>
       <w:r>
+        <w:lastRenderedPageBreak/>
         <w:t xml:space="preserve">Quadro </w:t>
       </w:r>
       <w:fldSimple w:instr=" SEQ Quadro \* ARABIC ">
@@ -37419,6 +37560,7 @@
               <w:ind w:left="397" w:hanging="397"/>
             </w:pPr>
             <w:r>
+              <w:lastRenderedPageBreak/>
               <w:t>6.</w:t>
             </w:r>
             <w:r>
@@ -37486,6 +37628,7 @@
                 <w:b/>
                 <w:bCs/>
               </w:rPr>
+              <w:lastRenderedPageBreak/>
               <w:t>Fluxos alternativos</w:t>
             </w:r>
           </w:p>
@@ -38274,7 +38417,24 @@
             </w:r>
             <w:r>
               <w:tab/>
-              <w:t>O sistema indica os campos com problema, como CNPJ ou e-mail em formato inválido, e o fluxo retorna ao passo 5.</w:t>
+              <w:t>O sistema indica os campos com problema, como CNPJ ou e-mail em formato inválido</w:t>
+            </w:r>
+            <w:r>
+              <w:t xml:space="preserve"> (</w:t>
+            </w:r>
+            <w:hyperlink w:anchor="RN035" w:history="1">
+              <w:r>
+                <w:rPr>
+                  <w:rStyle w:val="Hyperlink"/>
+                </w:rPr>
+                <w:t>RN035</w:t>
+              </w:r>
+            </w:hyperlink>
+            <w:r>
+              <w:t>)</w:t>
+            </w:r>
+            <w:r>
+              <w:t>, e o fluxo retorna ao passo 5.</w:t>
             </w:r>
           </w:p>
         </w:tc>
@@ -38285,6 +38445,7 @@
         <w:pStyle w:val="Legenda"/>
       </w:pPr>
       <w:r>
+        <w:lastRenderedPageBreak/>
         <w:t xml:space="preserve">Quadro </w:t>
       </w:r>
       <w:fldSimple w:instr=" SEQ Quadro \* ARABIC ">
@@ -39207,6 +39368,7 @@
                 <w:b/>
                 <w:bCs/>
               </w:rPr>
+              <w:lastRenderedPageBreak/>
               <w:t>Fluxos alternativos</w:t>
             </w:r>
           </w:p>
@@ -40028,6 +40190,7 @@
                 <w:b/>
                 <w:bCs/>
               </w:rPr>
+              <w:lastRenderedPageBreak/>
               <w:t>FE03 – Data ou horário inválido (passo 7)</w:t>
             </w:r>
           </w:p>
@@ -40077,6 +40240,7 @@
         <w:pStyle w:val="Legenda"/>
       </w:pPr>
       <w:r>
+        <w:lastRenderedPageBreak/>
         <w:t xml:space="preserve">Quadro </w:t>
       </w:r>
       <w:fldSimple w:instr=" SEQ Quadro \* ARABIC ">
@@ -40809,6 +40973,7 @@
                 <w:b/>
                 <w:bCs/>
               </w:rPr>
+              <w:lastRenderedPageBreak/>
               <w:t>FE03 – Composição inválida (passo 7)</w:t>
             </w:r>
           </w:p>
@@ -42178,6 +42343,18 @@
       <w:szCs w:val="18"/>
     </w:rPr>
   </w:style>
+  <w:style w:type="character" w:styleId="MenoPendente">
+    <w:name w:val="Unresolved Mention"/>
+    <w:basedOn w:val="Fontepargpadro"/>
+    <w:uiPriority w:val="99"/>
+    <w:semiHidden/>
+    <w:unhideWhenUsed/>
+    <w:rsid w:val="00850FF2"/>
+    <w:rPr>
+      <w:color w:val="605E5C"/>
+      <w:shd w:val="clear" w:color="auto" w:fill="E1DFDD"/>
+    </w:rPr>
+  </w:style>
 </w:styles>
 </file>
 

</xml_diff>